<commit_message>
feat(sens): rebuild SensitiveDetectionNode to implement PDF text-only guards, zero-signal bypass, and edge routing
</commit_message>
<xml_diff>
--- a/documents/ADK Agent Graph Spec.docx
+++ b/documents/ADK Agent Graph Spec.docx
@@ -35,13 +35,23 @@
           <w:bCs/>
         </w:rPr>
       </w:pPr>
-      <w:r>
-        <w:rPr>
-          <w:rFonts w:ascii="Times New Roman" w:hAnsi="Times New Roman" w:cs="Times New Roman"/>
-          <w:b/>
-          <w:bCs/>
-        </w:rPr>
-        <w:t>CleanSlate AI – My PC Assistant</w:t>
+      <w:proofErr w:type="spellStart"/>
+      <w:r>
+        <w:rPr>
+          <w:rFonts w:ascii="Times New Roman" w:hAnsi="Times New Roman" w:cs="Times New Roman"/>
+          <w:b/>
+          <w:bCs/>
+        </w:rPr>
+        <w:t>CleanSlate</w:t>
+      </w:r>
+      <w:proofErr w:type="spellEnd"/>
+      <w:r>
+        <w:rPr>
+          <w:rFonts w:ascii="Times New Roman" w:hAnsi="Times New Roman" w:cs="Times New Roman"/>
+          <w:b/>
+          <w:bCs/>
+        </w:rPr>
+        <w:t xml:space="preserve"> AI – My PC Assistant</w:t>
       </w:r>
     </w:p>
     <w:p>
@@ -304,7 +314,21 @@
         <w:rPr>
           <w:rFonts w:ascii="Times New Roman" w:hAnsi="Times New Roman" w:cs="Times New Roman"/>
         </w:rPr>
-        <w:t>The nodes that make up CleanSlate AI</w:t>
+        <w:t xml:space="preserve">The nodes that make up </w:t>
+      </w:r>
+      <w:proofErr w:type="spellStart"/>
+      <w:r>
+        <w:rPr>
+          <w:rFonts w:ascii="Times New Roman" w:hAnsi="Times New Roman" w:cs="Times New Roman"/>
+        </w:rPr>
+        <w:t>CleanSlate</w:t>
+      </w:r>
+      <w:proofErr w:type="spellEnd"/>
+      <w:r>
+        <w:rPr>
+          <w:rFonts w:ascii="Times New Roman" w:hAnsi="Times New Roman" w:cs="Times New Roman"/>
+        </w:rPr>
+        <w:t xml:space="preserve"> AI</w:t>
       </w:r>
     </w:p>
     <w:p>
@@ -456,11 +480,19 @@
           <w:rFonts w:ascii="Times New Roman" w:hAnsi="Times New Roman" w:cs="Times New Roman"/>
         </w:rPr>
       </w:pPr>
-      <w:r>
-        <w:rPr>
-          <w:rFonts w:ascii="Times New Roman" w:hAnsi="Times New Roman" w:cs="Times New Roman"/>
-        </w:rPr>
-        <w:t xml:space="preserve">CleanSlate AI is a </w:t>
+      <w:proofErr w:type="spellStart"/>
+      <w:r>
+        <w:rPr>
+          <w:rFonts w:ascii="Times New Roman" w:hAnsi="Times New Roman" w:cs="Times New Roman"/>
+        </w:rPr>
+        <w:t>CleanSlate</w:t>
+      </w:r>
+      <w:proofErr w:type="spellEnd"/>
+      <w:r>
+        <w:rPr>
+          <w:rFonts w:ascii="Times New Roman" w:hAnsi="Times New Roman" w:cs="Times New Roman"/>
+        </w:rPr>
+        <w:t xml:space="preserve"> AI is a </w:t>
       </w:r>
       <w:r>
         <w:rPr>
@@ -513,11 +545,19 @@
           <w:rFonts w:ascii="Times New Roman" w:hAnsi="Times New Roman" w:cs="Times New Roman"/>
         </w:rPr>
       </w:pPr>
-      <w:r>
-        <w:rPr>
-          <w:rFonts w:ascii="Times New Roman" w:hAnsi="Times New Roman" w:cs="Times New Roman"/>
-        </w:rPr>
-        <w:t>MyPCAssistantNode (all user interactions start here)</w:t>
+      <w:proofErr w:type="spellStart"/>
+      <w:r>
+        <w:rPr>
+          <w:rFonts w:ascii="Times New Roman" w:hAnsi="Times New Roman" w:cs="Times New Roman"/>
+        </w:rPr>
+        <w:t>MyPCAssistantNode</w:t>
+      </w:r>
+      <w:proofErr w:type="spellEnd"/>
+      <w:r>
+        <w:rPr>
+          <w:rFonts w:ascii="Times New Roman" w:hAnsi="Times New Roman" w:cs="Times New Roman"/>
+        </w:rPr>
+        <w:t xml:space="preserve"> (all user interactions start here)</w:t>
       </w:r>
     </w:p>
     <w:p>
@@ -946,6 +986,7 @@
                 <w:bCs/>
               </w:rPr>
             </w:pPr>
+            <w:proofErr w:type="spellStart"/>
             <w:r>
               <w:rPr>
                 <w:rFonts w:ascii="Times New Roman" w:hAnsi="Times New Roman" w:cs="Times New Roman"/>
@@ -954,6 +995,7 @@
               </w:rPr>
               <w:t>MyPCAssistantNode</w:t>
             </w:r>
+            <w:proofErr w:type="spellEnd"/>
           </w:p>
         </w:tc>
         <w:tc>
@@ -999,6 +1041,7 @@
                 <w:bCs/>
               </w:rPr>
             </w:pPr>
+            <w:proofErr w:type="spellStart"/>
             <w:r>
               <w:rPr>
                 <w:rFonts w:ascii="Times New Roman" w:hAnsi="Times New Roman" w:cs="Times New Roman"/>
@@ -1007,6 +1050,7 @@
               </w:rPr>
               <w:t>FolderScopeNode</w:t>
             </w:r>
+            <w:proofErr w:type="spellEnd"/>
           </w:p>
         </w:tc>
         <w:tc>
@@ -1052,6 +1096,7 @@
                 <w:bCs/>
               </w:rPr>
             </w:pPr>
+            <w:proofErr w:type="spellStart"/>
             <w:r>
               <w:rPr>
                 <w:rFonts w:ascii="Times New Roman" w:hAnsi="Times New Roman" w:cs="Times New Roman"/>
@@ -1060,6 +1105,7 @@
               </w:rPr>
               <w:t>FileDiscoveryNode</w:t>
             </w:r>
+            <w:proofErr w:type="spellEnd"/>
           </w:p>
         </w:tc>
         <w:tc>
@@ -1105,6 +1151,7 @@
                 <w:bCs/>
               </w:rPr>
             </w:pPr>
+            <w:proofErr w:type="spellStart"/>
             <w:r>
               <w:rPr>
                 <w:rFonts w:ascii="Times New Roman" w:hAnsi="Times New Roman" w:cs="Times New Roman"/>
@@ -1113,6 +1160,7 @@
               </w:rPr>
               <w:t>ClassificationNode</w:t>
             </w:r>
+            <w:proofErr w:type="spellEnd"/>
           </w:p>
         </w:tc>
         <w:tc>
@@ -1158,6 +1206,7 @@
                 <w:bCs/>
               </w:rPr>
             </w:pPr>
+            <w:proofErr w:type="spellStart"/>
             <w:r>
               <w:rPr>
                 <w:rFonts w:ascii="Times New Roman" w:hAnsi="Times New Roman" w:cs="Times New Roman"/>
@@ -1166,6 +1215,7 @@
               </w:rPr>
               <w:t>DuplicateDetectionNode</w:t>
             </w:r>
+            <w:proofErr w:type="spellEnd"/>
           </w:p>
         </w:tc>
         <w:tc>
@@ -1211,6 +1261,7 @@
                 <w:bCs/>
               </w:rPr>
             </w:pPr>
+            <w:proofErr w:type="spellStart"/>
             <w:r>
               <w:rPr>
                 <w:rFonts w:ascii="Times New Roman" w:hAnsi="Times New Roman" w:cs="Times New Roman"/>
@@ -1219,6 +1270,7 @@
               </w:rPr>
               <w:t>SensitiveDetectionNode</w:t>
             </w:r>
+            <w:proofErr w:type="spellEnd"/>
           </w:p>
         </w:tc>
         <w:tc>
@@ -1264,6 +1316,7 @@
                 <w:bCs/>
               </w:rPr>
             </w:pPr>
+            <w:proofErr w:type="spellStart"/>
             <w:r>
               <w:rPr>
                 <w:rFonts w:ascii="Times New Roman" w:hAnsi="Times New Roman" w:cs="Times New Roman"/>
@@ -1272,6 +1325,7 @@
               </w:rPr>
               <w:t>OptimizationPlannerNode</w:t>
             </w:r>
+            <w:proofErr w:type="spellEnd"/>
           </w:p>
         </w:tc>
         <w:tc>
@@ -1317,6 +1371,7 @@
                 <w:bCs/>
               </w:rPr>
             </w:pPr>
+            <w:proofErr w:type="spellStart"/>
             <w:r>
               <w:rPr>
                 <w:rFonts w:ascii="Times New Roman" w:hAnsi="Times New Roman" w:cs="Times New Roman"/>
@@ -1325,6 +1380,7 @@
               </w:rPr>
               <w:t>HITLApprovalNode</w:t>
             </w:r>
+            <w:proofErr w:type="spellEnd"/>
           </w:p>
         </w:tc>
         <w:tc>
@@ -1370,6 +1426,7 @@
                 <w:bCs/>
               </w:rPr>
             </w:pPr>
+            <w:proofErr w:type="spellStart"/>
             <w:r>
               <w:rPr>
                 <w:rFonts w:ascii="Times New Roman" w:hAnsi="Times New Roman" w:cs="Times New Roman"/>
@@ -1378,6 +1435,7 @@
               </w:rPr>
               <w:t>ExecutionNode</w:t>
             </w:r>
+            <w:proofErr w:type="spellEnd"/>
           </w:p>
         </w:tc>
         <w:tc>
@@ -1423,6 +1481,7 @@
                 <w:bCs/>
               </w:rPr>
             </w:pPr>
+            <w:proofErr w:type="spellStart"/>
             <w:r>
               <w:rPr>
                 <w:rFonts w:ascii="Times New Roman" w:hAnsi="Times New Roman" w:cs="Times New Roman"/>
@@ -1431,6 +1490,7 @@
               </w:rPr>
               <w:t>RollbackNode</w:t>
             </w:r>
+            <w:proofErr w:type="spellEnd"/>
           </w:p>
         </w:tc>
         <w:tc>
@@ -1476,6 +1536,7 @@
                 <w:bCs/>
               </w:rPr>
             </w:pPr>
+            <w:proofErr w:type="spellStart"/>
             <w:r>
               <w:rPr>
                 <w:rFonts w:ascii="Times New Roman" w:hAnsi="Times New Roman" w:cs="Times New Roman"/>
@@ -1484,6 +1545,7 @@
               </w:rPr>
               <w:t>SummaryNode</w:t>
             </w:r>
+            <w:proofErr w:type="spellEnd"/>
           </w:p>
         </w:tc>
         <w:tc>
@@ -1529,6 +1591,7 @@
                 <w:bCs/>
               </w:rPr>
             </w:pPr>
+            <w:proofErr w:type="spellStart"/>
             <w:r>
               <w:rPr>
                 <w:rFonts w:ascii="Times New Roman" w:hAnsi="Times New Roman" w:cs="Times New Roman"/>
@@ -1537,6 +1600,7 @@
               </w:rPr>
               <w:t>WeeklyOrganizerNode</w:t>
             </w:r>
+            <w:proofErr w:type="spellEnd"/>
           </w:p>
         </w:tc>
         <w:tc>
@@ -1650,7 +1714,25 @@
           <w:b/>
           <w:bCs/>
         </w:rPr>
-        <w:t>1. MyPCAssistantNode (ENTRY POINT)</w:t>
+        <w:t xml:space="preserve">1. </w:t>
+      </w:r>
+      <w:proofErr w:type="spellStart"/>
+      <w:r>
+        <w:rPr>
+          <w:rFonts w:ascii="Times New Roman" w:hAnsi="Times New Roman" w:cs="Times New Roman"/>
+          <w:b/>
+          <w:bCs/>
+        </w:rPr>
+        <w:t>MyPCAssistantNode</w:t>
+      </w:r>
+      <w:proofErr w:type="spellEnd"/>
+      <w:r>
+        <w:rPr>
+          <w:rFonts w:ascii="Times New Roman" w:hAnsi="Times New Roman" w:cs="Times New Roman"/>
+          <w:b/>
+          <w:bCs/>
+        </w:rPr>
+        <w:t xml:space="preserve"> (ENTRY POINT)</w:t>
       </w:r>
     </w:p>
     <w:p>
@@ -1815,7 +1897,21 @@
         <w:rPr>
           <w:rFonts w:ascii="Times New Roman" w:hAnsi="Times New Roman" w:cs="Times New Roman"/>
         </w:rPr>
-        <w:t>Only trigger FolderScopeNode when cleanup intent is detected</w:t>
+        <w:t xml:space="preserve">Only trigger </w:t>
+      </w:r>
+      <w:proofErr w:type="spellStart"/>
+      <w:r>
+        <w:rPr>
+          <w:rFonts w:ascii="Times New Roman" w:hAnsi="Times New Roman" w:cs="Times New Roman"/>
+        </w:rPr>
+        <w:t>FolderScopeNode</w:t>
+      </w:r>
+      <w:proofErr w:type="spellEnd"/>
+      <w:r>
+        <w:rPr>
+          <w:rFonts w:ascii="Times New Roman" w:hAnsi="Times New Roman" w:cs="Times New Roman"/>
+        </w:rPr>
+        <w:t xml:space="preserve"> when cleanup intent is detected</w:t>
       </w:r>
     </w:p>
     <w:p>
@@ -1854,12 +1950,14 @@
           <w:rFonts w:ascii="Times New Roman" w:hAnsi="Times New Roman" w:cs="Times New Roman"/>
         </w:rPr>
       </w:pPr>
+      <w:proofErr w:type="spellStart"/>
       <w:r>
         <w:rPr>
           <w:rFonts w:ascii="Times New Roman" w:hAnsi="Times New Roman" w:cs="Times New Roman"/>
         </w:rPr>
         <w:t>user_query</w:t>
       </w:r>
+      <w:proofErr w:type="spellEnd"/>
     </w:p>
     <w:p>
       <w:pPr>
@@ -1964,6 +2062,7 @@
         </w:rPr>
         <w:t xml:space="preserve">If cleanup → </w:t>
       </w:r>
+      <w:proofErr w:type="spellStart"/>
       <w:r>
         <w:rPr>
           <w:rFonts w:ascii="Times New Roman" w:hAnsi="Times New Roman" w:cs="Times New Roman"/>
@@ -1972,6 +2071,7 @@
         </w:rPr>
         <w:t>FolderScopeNode</w:t>
       </w:r>
+      <w:proofErr w:type="spellEnd"/>
     </w:p>
     <w:p>
       <w:pPr>
@@ -1990,13 +2090,23 @@
         </w:rPr>
         <w:t xml:space="preserve">If search → </w:t>
       </w:r>
-      <w:r>
-        <w:rPr>
-          <w:rFonts w:ascii="Times New Roman" w:hAnsi="Times New Roman" w:cs="Times New Roman"/>
-          <w:b/>
-          <w:bCs/>
-        </w:rPr>
-        <w:t>FileDiscoveryNode (search mode)</w:t>
+      <w:proofErr w:type="spellStart"/>
+      <w:r>
+        <w:rPr>
+          <w:rFonts w:ascii="Times New Roman" w:hAnsi="Times New Roman" w:cs="Times New Roman"/>
+          <w:b/>
+          <w:bCs/>
+        </w:rPr>
+        <w:t>FileDiscoveryNode</w:t>
+      </w:r>
+      <w:proofErr w:type="spellEnd"/>
+      <w:r>
+        <w:rPr>
+          <w:rFonts w:ascii="Times New Roman" w:hAnsi="Times New Roman" w:cs="Times New Roman"/>
+          <w:b/>
+          <w:bCs/>
+        </w:rPr>
+        <w:t xml:space="preserve"> (search mode)</w:t>
       </w:r>
     </w:p>
     <w:p>
@@ -2016,6 +2126,7 @@
         </w:rPr>
         <w:t xml:space="preserve">If explain → </w:t>
       </w:r>
+      <w:proofErr w:type="spellStart"/>
       <w:r>
         <w:rPr>
           <w:rFonts w:ascii="Times New Roman" w:hAnsi="Times New Roman" w:cs="Times New Roman"/>
@@ -2024,6 +2135,7 @@
         </w:rPr>
         <w:t>SummaryNode</w:t>
       </w:r>
+      <w:proofErr w:type="spellEnd"/>
     </w:p>
     <w:p>
       <w:pPr>
@@ -2068,7 +2180,25 @@
           <w:b/>
           <w:bCs/>
         </w:rPr>
-        <w:t>2. FolderScopeNode (CONDITIONAL)</w:t>
+        <w:t xml:space="preserve">2. </w:t>
+      </w:r>
+      <w:proofErr w:type="spellStart"/>
+      <w:r>
+        <w:rPr>
+          <w:rFonts w:ascii="Times New Roman" w:hAnsi="Times New Roman" w:cs="Times New Roman"/>
+          <w:b/>
+          <w:bCs/>
+        </w:rPr>
+        <w:t>FolderScopeNode</w:t>
+      </w:r>
+      <w:proofErr w:type="spellEnd"/>
+      <w:r>
+        <w:rPr>
+          <w:rFonts w:ascii="Times New Roman" w:hAnsi="Times New Roman" w:cs="Times New Roman"/>
+          <w:b/>
+          <w:bCs/>
+        </w:rPr>
+        <w:t xml:space="preserve"> (CONDITIONAL)</w:t>
       </w:r>
     </w:p>
     <w:p>
@@ -2128,7 +2258,21 @@
         <w:rPr>
           <w:rFonts w:ascii="Times New Roman" w:hAnsi="Times New Roman" w:cs="Times New Roman"/>
         </w:rPr>
-        <w:t>Only runs when MyPCAssistantNode detects cleanup intent.</w:t>
+        <w:t xml:space="preserve">Only runs when </w:t>
+      </w:r>
+      <w:proofErr w:type="spellStart"/>
+      <w:r>
+        <w:rPr>
+          <w:rFonts w:ascii="Times New Roman" w:hAnsi="Times New Roman" w:cs="Times New Roman"/>
+        </w:rPr>
+        <w:t>MyPCAssistantNode</w:t>
+      </w:r>
+      <w:proofErr w:type="spellEnd"/>
+      <w:r>
+        <w:rPr>
+          <w:rFonts w:ascii="Times New Roman" w:hAnsi="Times New Roman" w:cs="Times New Roman"/>
+        </w:rPr>
+        <w:t xml:space="preserve"> detects cleanup intent.</w:t>
       </w:r>
     </w:p>
     <w:p>
@@ -2243,11 +2387,19 @@
           <w:rFonts w:ascii="Times New Roman" w:hAnsi="Times New Roman" w:cs="Times New Roman"/>
         </w:rPr>
       </w:pPr>
-      <w:r>
-        <w:rPr>
-          <w:rFonts w:ascii="Times New Roman" w:hAnsi="Times New Roman" w:cs="Times New Roman"/>
-        </w:rPr>
-        <w:t>cleanup_intent: true</w:t>
+      <w:proofErr w:type="spellStart"/>
+      <w:r>
+        <w:rPr>
+          <w:rFonts w:ascii="Times New Roman" w:hAnsi="Times New Roman" w:cs="Times New Roman"/>
+        </w:rPr>
+        <w:t>cleanup_intent</w:t>
+      </w:r>
+      <w:proofErr w:type="spellEnd"/>
+      <w:r>
+        <w:rPr>
+          <w:rFonts w:ascii="Times New Roman" w:hAnsi="Times New Roman" w:cs="Times New Roman"/>
+        </w:rPr>
+        <w:t>: true</w:t>
       </w:r>
     </w:p>
     <w:p>
@@ -2287,11 +2439,19 @@
           <w:rFonts w:ascii="Times New Roman" w:hAnsi="Times New Roman" w:cs="Times New Roman"/>
         </w:rPr>
       </w:pPr>
-      <w:r>
-        <w:rPr>
-          <w:rFonts w:ascii="Times New Roman" w:hAnsi="Times New Roman" w:cs="Times New Roman"/>
-        </w:rPr>
-        <w:t>folder_scope_policy {</w:t>
+      <w:proofErr w:type="spellStart"/>
+      <w:r>
+        <w:rPr>
+          <w:rFonts w:ascii="Times New Roman" w:hAnsi="Times New Roman" w:cs="Times New Roman"/>
+        </w:rPr>
+        <w:t>folder_scope_policy</w:t>
+      </w:r>
+      <w:proofErr w:type="spellEnd"/>
+      <w:r>
+        <w:rPr>
+          <w:rFonts w:ascii="Times New Roman" w:hAnsi="Times New Roman" w:cs="Times New Roman"/>
+        </w:rPr>
+        <w:t xml:space="preserve"> {</w:t>
       </w:r>
     </w:p>
     <w:p>
@@ -2305,7 +2465,35 @@
         <w:rPr>
           <w:rFonts w:ascii="Times New Roman" w:hAnsi="Times New Roman" w:cs="Times New Roman"/>
         </w:rPr>
-        <w:t xml:space="preserve">  allowed_paths[],</w:t>
+        <w:t xml:space="preserve">  </w:t>
+      </w:r>
+      <w:proofErr w:type="spellStart"/>
+      <w:r>
+        <w:rPr>
+          <w:rFonts w:ascii="Times New Roman" w:hAnsi="Times New Roman" w:cs="Times New Roman"/>
+        </w:rPr>
+        <w:t>allowed_</w:t>
+      </w:r>
+      <w:proofErr w:type="gramStart"/>
+      <w:r>
+        <w:rPr>
+          <w:rFonts w:ascii="Times New Roman" w:hAnsi="Times New Roman" w:cs="Times New Roman"/>
+        </w:rPr>
+        <w:t>paths</w:t>
+      </w:r>
+      <w:proofErr w:type="spellEnd"/>
+      <w:r>
+        <w:rPr>
+          <w:rFonts w:ascii="Times New Roman" w:hAnsi="Times New Roman" w:cs="Times New Roman"/>
+        </w:rPr>
+        <w:t>[</w:t>
+      </w:r>
+      <w:proofErr w:type="gramEnd"/>
+      <w:r>
+        <w:rPr>
+          <w:rFonts w:ascii="Times New Roman" w:hAnsi="Times New Roman" w:cs="Times New Roman"/>
+        </w:rPr>
+        <w:t>],</w:t>
       </w:r>
     </w:p>
     <w:p>
@@ -2319,7 +2507,35 @@
         <w:rPr>
           <w:rFonts w:ascii="Times New Roman" w:hAnsi="Times New Roman" w:cs="Times New Roman"/>
         </w:rPr>
-        <w:t xml:space="preserve">  blocked_paths[]</w:t>
+        <w:t xml:space="preserve">  </w:t>
+      </w:r>
+      <w:proofErr w:type="spellStart"/>
+      <w:r>
+        <w:rPr>
+          <w:rFonts w:ascii="Times New Roman" w:hAnsi="Times New Roman" w:cs="Times New Roman"/>
+        </w:rPr>
+        <w:t>blocked_</w:t>
+      </w:r>
+      <w:proofErr w:type="gramStart"/>
+      <w:r>
+        <w:rPr>
+          <w:rFonts w:ascii="Times New Roman" w:hAnsi="Times New Roman" w:cs="Times New Roman"/>
+        </w:rPr>
+        <w:t>paths</w:t>
+      </w:r>
+      <w:proofErr w:type="spellEnd"/>
+      <w:r>
+        <w:rPr>
+          <w:rFonts w:ascii="Times New Roman" w:hAnsi="Times New Roman" w:cs="Times New Roman"/>
+        </w:rPr>
+        <w:t>[</w:t>
+      </w:r>
+      <w:proofErr w:type="gramEnd"/>
+      <w:r>
+        <w:rPr>
+          <w:rFonts w:ascii="Times New Roman" w:hAnsi="Times New Roman" w:cs="Times New Roman"/>
+        </w:rPr>
+        <w:t>]</w:t>
       </w:r>
     </w:p>
     <w:p>
@@ -2376,8 +2592,16 @@
         <w:rPr>
           <w:rFonts w:ascii="Times New Roman" w:hAnsi="Times New Roman" w:cs="Times New Roman"/>
         </w:rPr>
-        <w:t>→ FileDiscoveryNode</w:t>
-      </w:r>
+        <w:t xml:space="preserve">→ </w:t>
+      </w:r>
+      <w:proofErr w:type="spellStart"/>
+      <w:r>
+        <w:rPr>
+          <w:rFonts w:ascii="Times New Roman" w:hAnsi="Times New Roman" w:cs="Times New Roman"/>
+        </w:rPr>
+        <w:t>FileDiscoveryNode</w:t>
+      </w:r>
+      <w:proofErr w:type="spellEnd"/>
     </w:p>
     <w:p>
       <w:pPr>
@@ -2425,8 +2649,18 @@
           <w:b/>
           <w:bCs/>
         </w:rPr>
-        <w:t>. FileDiscoveryNode</w:t>
-      </w:r>
+        <w:t xml:space="preserve">. </w:t>
+      </w:r>
+      <w:proofErr w:type="spellStart"/>
+      <w:r>
+        <w:rPr>
+          <w:rFonts w:ascii="Times New Roman" w:hAnsi="Times New Roman" w:cs="Times New Roman"/>
+          <w:b/>
+          <w:bCs/>
+        </w:rPr>
+        <w:t>FileDiscoveryNode</w:t>
+      </w:r>
+      <w:proofErr w:type="spellEnd"/>
     </w:p>
     <w:p>
       <w:pPr>
@@ -2498,6 +2732,7 @@
         </w:rPr>
         <w:t xml:space="preserve">Scans only </w:t>
       </w:r>
+      <w:proofErr w:type="spellStart"/>
       <w:r>
         <w:rPr>
           <w:rFonts w:ascii="Times New Roman" w:hAnsi="Times New Roman" w:cs="Times New Roman"/>
@@ -2506,6 +2741,7 @@
         </w:rPr>
         <w:t>allowed_paths</w:t>
       </w:r>
+      <w:proofErr w:type="spellEnd"/>
     </w:p>
     <w:p>
       <w:pPr>
@@ -2524,6 +2760,7 @@
         </w:rPr>
         <w:t xml:space="preserve">Ignores </w:t>
       </w:r>
+      <w:proofErr w:type="spellStart"/>
       <w:r>
         <w:rPr>
           <w:rFonts w:ascii="Times New Roman" w:hAnsi="Times New Roman" w:cs="Times New Roman"/>
@@ -2532,6 +2769,7 @@
         </w:rPr>
         <w:t>blocked_paths</w:t>
       </w:r>
+      <w:proofErr w:type="spellEnd"/>
     </w:p>
     <w:p>
       <w:pPr>
@@ -2588,12 +2826,14 @@
           <w:rFonts w:ascii="Times New Roman" w:hAnsi="Times New Roman" w:cs="Times New Roman"/>
         </w:rPr>
       </w:pPr>
+      <w:proofErr w:type="spellStart"/>
       <w:r>
         <w:rPr>
           <w:rFonts w:ascii="Times New Roman" w:hAnsi="Times New Roman" w:cs="Times New Roman"/>
         </w:rPr>
         <w:t>folder_scope_policy</w:t>
       </w:r>
+      <w:proofErr w:type="spellEnd"/>
     </w:p>
     <w:p>
       <w:pPr>
@@ -2602,12 +2842,20 @@
           <w:rFonts w:ascii="Times New Roman" w:hAnsi="Times New Roman" w:cs="Times New Roman"/>
         </w:rPr>
       </w:pPr>
+      <w:proofErr w:type="spellStart"/>
       <w:r>
         <w:rPr>
           <w:rFonts w:ascii="Times New Roman" w:hAnsi="Times New Roman" w:cs="Times New Roman"/>
         </w:rPr>
         <w:lastRenderedPageBreak/>
-        <w:t>search_query (optional)</w:t>
+        <w:t>search_query</w:t>
+      </w:r>
+      <w:proofErr w:type="spellEnd"/>
+      <w:r>
+        <w:rPr>
+          <w:rFonts w:ascii="Times New Roman" w:hAnsi="Times New Roman" w:cs="Times New Roman"/>
+        </w:rPr>
+        <w:t xml:space="preserve"> (optional)</w:t>
       </w:r>
     </w:p>
     <w:p>
@@ -2667,11 +2915,33 @@
           <w:rFonts w:ascii="Times New Roman" w:hAnsi="Times New Roman" w:cs="Times New Roman"/>
         </w:rPr>
       </w:pPr>
-      <w:r>
-        <w:rPr>
-          <w:rFonts w:ascii="Times New Roman" w:hAnsi="Times New Roman" w:cs="Times New Roman"/>
-        </w:rPr>
-        <w:t>file_inventory[]</w:t>
+      <w:proofErr w:type="spellStart"/>
+      <w:r>
+        <w:rPr>
+          <w:rFonts w:ascii="Times New Roman" w:hAnsi="Times New Roman" w:cs="Times New Roman"/>
+        </w:rPr>
+        <w:t>file_</w:t>
+      </w:r>
+      <w:proofErr w:type="gramStart"/>
+      <w:r>
+        <w:rPr>
+          <w:rFonts w:ascii="Times New Roman" w:hAnsi="Times New Roman" w:cs="Times New Roman"/>
+        </w:rPr>
+        <w:t>inventory</w:t>
+      </w:r>
+      <w:proofErr w:type="spellEnd"/>
+      <w:r>
+        <w:rPr>
+          <w:rFonts w:ascii="Times New Roman" w:hAnsi="Times New Roman" w:cs="Times New Roman"/>
+        </w:rPr>
+        <w:t>[</w:t>
+      </w:r>
+      <w:proofErr w:type="gramEnd"/>
+      <w:r>
+        <w:rPr>
+          <w:rFonts w:ascii="Times New Roman" w:hAnsi="Times New Roman" w:cs="Times New Roman"/>
+        </w:rPr>
+        <w:t>]</w:t>
       </w:r>
     </w:p>
     <w:p>
@@ -2714,8 +2984,44 @@
         <w:rPr>
           <w:rFonts w:ascii="Times New Roman" w:hAnsi="Times New Roman" w:cs="Times New Roman"/>
         </w:rPr>
-        <w:t>→ ClassificationNode → DuplicateDetectionNode → SensitiveDetectionNode</w:t>
-      </w:r>
+        <w:t xml:space="preserve">→ </w:t>
+      </w:r>
+      <w:proofErr w:type="spellStart"/>
+      <w:r>
+        <w:rPr>
+          <w:rFonts w:ascii="Times New Roman" w:hAnsi="Times New Roman" w:cs="Times New Roman"/>
+        </w:rPr>
+        <w:t>ClassificationNode</w:t>
+      </w:r>
+      <w:proofErr w:type="spellEnd"/>
+      <w:r>
+        <w:rPr>
+          <w:rFonts w:ascii="Times New Roman" w:hAnsi="Times New Roman" w:cs="Times New Roman"/>
+        </w:rPr>
+        <w:t xml:space="preserve"> → </w:t>
+      </w:r>
+      <w:proofErr w:type="spellStart"/>
+      <w:r>
+        <w:rPr>
+          <w:rFonts w:ascii="Times New Roman" w:hAnsi="Times New Roman" w:cs="Times New Roman"/>
+        </w:rPr>
+        <w:t>DuplicateDetectionNode</w:t>
+      </w:r>
+      <w:proofErr w:type="spellEnd"/>
+      <w:r>
+        <w:rPr>
+          <w:rFonts w:ascii="Times New Roman" w:hAnsi="Times New Roman" w:cs="Times New Roman"/>
+        </w:rPr>
+        <w:t xml:space="preserve"> → </w:t>
+      </w:r>
+      <w:proofErr w:type="spellStart"/>
+      <w:r>
+        <w:rPr>
+          <w:rFonts w:ascii="Times New Roman" w:hAnsi="Times New Roman" w:cs="Times New Roman"/>
+        </w:rPr>
+        <w:t>SensitiveDetectionNode</w:t>
+      </w:r>
+      <w:proofErr w:type="spellEnd"/>
     </w:p>
     <w:p>
       <w:pPr>
@@ -2746,8 +3052,18 @@
           <w:b/>
           <w:bCs/>
         </w:rPr>
-        <w:t>. ClassificationNode</w:t>
-      </w:r>
+        <w:t xml:space="preserve">. </w:t>
+      </w:r>
+      <w:proofErr w:type="spellStart"/>
+      <w:r>
+        <w:rPr>
+          <w:rFonts w:ascii="Times New Roman" w:hAnsi="Times New Roman" w:cs="Times New Roman"/>
+          <w:b/>
+          <w:bCs/>
+        </w:rPr>
+        <w:t>ClassificationNode</w:t>
+      </w:r>
+      <w:proofErr w:type="spellEnd"/>
     </w:p>
     <w:p>
       <w:pPr>
@@ -2866,12 +3182,14 @@
           <w:rFonts w:ascii="Times New Roman" w:hAnsi="Times New Roman" w:cs="Times New Roman"/>
         </w:rPr>
       </w:pPr>
+      <w:proofErr w:type="spellStart"/>
       <w:r>
         <w:rPr>
           <w:rFonts w:ascii="Times New Roman" w:hAnsi="Times New Roman" w:cs="Times New Roman"/>
         </w:rPr>
         <w:t>file_inventory</w:t>
       </w:r>
+      <w:proofErr w:type="spellEnd"/>
     </w:p>
     <w:p>
       <w:pPr>
@@ -2922,11 +3240,33 @@
           <w:rFonts w:ascii="Times New Roman" w:hAnsi="Times New Roman" w:cs="Times New Roman"/>
         </w:rPr>
       </w:pPr>
-      <w:r>
-        <w:rPr>
-          <w:rFonts w:ascii="Times New Roman" w:hAnsi="Times New Roman" w:cs="Times New Roman"/>
-        </w:rPr>
-        <w:t>classified_files[]</w:t>
+      <w:proofErr w:type="spellStart"/>
+      <w:r>
+        <w:rPr>
+          <w:rFonts w:ascii="Times New Roman" w:hAnsi="Times New Roman" w:cs="Times New Roman"/>
+        </w:rPr>
+        <w:t>classified_</w:t>
+      </w:r>
+      <w:proofErr w:type="gramStart"/>
+      <w:r>
+        <w:rPr>
+          <w:rFonts w:ascii="Times New Roman" w:hAnsi="Times New Roman" w:cs="Times New Roman"/>
+        </w:rPr>
+        <w:t>files</w:t>
+      </w:r>
+      <w:proofErr w:type="spellEnd"/>
+      <w:r>
+        <w:rPr>
+          <w:rFonts w:ascii="Times New Roman" w:hAnsi="Times New Roman" w:cs="Times New Roman"/>
+        </w:rPr>
+        <w:t>[</w:t>
+      </w:r>
+      <w:proofErr w:type="gramEnd"/>
+      <w:r>
+        <w:rPr>
+          <w:rFonts w:ascii="Times New Roman" w:hAnsi="Times New Roman" w:cs="Times New Roman"/>
+        </w:rPr>
+        <w:t>]</w:t>
       </w:r>
     </w:p>
     <w:p>
@@ -2969,8 +3309,30 @@
         <w:rPr>
           <w:rFonts w:ascii="Times New Roman" w:hAnsi="Times New Roman" w:cs="Times New Roman"/>
         </w:rPr>
-        <w:t>→ DuplicateDetectionNode → SensitiveDetectionNode</w:t>
-      </w:r>
+        <w:t xml:space="preserve">→ </w:t>
+      </w:r>
+      <w:proofErr w:type="spellStart"/>
+      <w:r>
+        <w:rPr>
+          <w:rFonts w:ascii="Times New Roman" w:hAnsi="Times New Roman" w:cs="Times New Roman"/>
+        </w:rPr>
+        <w:t>DuplicateDetectionNode</w:t>
+      </w:r>
+      <w:proofErr w:type="spellEnd"/>
+      <w:r>
+        <w:rPr>
+          <w:rFonts w:ascii="Times New Roman" w:hAnsi="Times New Roman" w:cs="Times New Roman"/>
+        </w:rPr>
+        <w:t xml:space="preserve"> → </w:t>
+      </w:r>
+      <w:proofErr w:type="spellStart"/>
+      <w:r>
+        <w:rPr>
+          <w:rFonts w:ascii="Times New Roman" w:hAnsi="Times New Roman" w:cs="Times New Roman"/>
+        </w:rPr>
+        <w:t>SensitiveDetectionNode</w:t>
+      </w:r>
+      <w:proofErr w:type="spellEnd"/>
     </w:p>
     <w:p>
       <w:pPr>
@@ -3001,8 +3363,18 @@
           <w:b/>
           <w:bCs/>
         </w:rPr>
-        <w:t>. DuplicateDetectionNode</w:t>
-      </w:r>
+        <w:t xml:space="preserve">. </w:t>
+      </w:r>
+      <w:proofErr w:type="spellStart"/>
+      <w:r>
+        <w:rPr>
+          <w:rFonts w:ascii="Times New Roman" w:hAnsi="Times New Roman" w:cs="Times New Roman"/>
+          <w:b/>
+          <w:bCs/>
+        </w:rPr>
+        <w:t>DuplicateDetectionNode</w:t>
+      </w:r>
+      <w:proofErr w:type="spellEnd"/>
     </w:p>
     <w:p>
       <w:pPr>
@@ -3142,12 +3514,14 @@
           <w:rFonts w:ascii="Times New Roman" w:hAnsi="Times New Roman" w:cs="Times New Roman"/>
         </w:rPr>
       </w:pPr>
+      <w:proofErr w:type="spellStart"/>
       <w:r>
         <w:rPr>
           <w:rFonts w:ascii="Times New Roman" w:hAnsi="Times New Roman" w:cs="Times New Roman"/>
         </w:rPr>
         <w:t>file_inventory</w:t>
       </w:r>
+      <w:proofErr w:type="spellEnd"/>
     </w:p>
     <w:p>
       <w:pPr>
@@ -3198,11 +3572,33 @@
           <w:rFonts w:ascii="Times New Roman" w:hAnsi="Times New Roman" w:cs="Times New Roman"/>
         </w:rPr>
       </w:pPr>
-      <w:r>
-        <w:rPr>
-          <w:rFonts w:ascii="Times New Roman" w:hAnsi="Times New Roman" w:cs="Times New Roman"/>
-        </w:rPr>
-        <w:t>duplicate_groups[]</w:t>
+      <w:proofErr w:type="spellStart"/>
+      <w:r>
+        <w:rPr>
+          <w:rFonts w:ascii="Times New Roman" w:hAnsi="Times New Roman" w:cs="Times New Roman"/>
+        </w:rPr>
+        <w:t>duplicate_</w:t>
+      </w:r>
+      <w:proofErr w:type="gramStart"/>
+      <w:r>
+        <w:rPr>
+          <w:rFonts w:ascii="Times New Roman" w:hAnsi="Times New Roman" w:cs="Times New Roman"/>
+        </w:rPr>
+        <w:t>groups</w:t>
+      </w:r>
+      <w:proofErr w:type="spellEnd"/>
+      <w:r>
+        <w:rPr>
+          <w:rFonts w:ascii="Times New Roman" w:hAnsi="Times New Roman" w:cs="Times New Roman"/>
+        </w:rPr>
+        <w:t>[</w:t>
+      </w:r>
+      <w:proofErr w:type="gramEnd"/>
+      <w:r>
+        <w:rPr>
+          <w:rFonts w:ascii="Times New Roman" w:hAnsi="Times New Roman" w:cs="Times New Roman"/>
+        </w:rPr>
+        <w:t>]</w:t>
       </w:r>
     </w:p>
     <w:p>
@@ -3245,8 +3641,16 @@
         <w:rPr>
           <w:rFonts w:ascii="Times New Roman" w:hAnsi="Times New Roman" w:cs="Times New Roman"/>
         </w:rPr>
-        <w:t>→ SensitiveDetectionNode</w:t>
-      </w:r>
+        <w:t xml:space="preserve">→ </w:t>
+      </w:r>
+      <w:proofErr w:type="spellStart"/>
+      <w:r>
+        <w:rPr>
+          <w:rFonts w:ascii="Times New Roman" w:hAnsi="Times New Roman" w:cs="Times New Roman"/>
+        </w:rPr>
+        <w:t>SensitiveDetectionNode</w:t>
+      </w:r>
+      <w:proofErr w:type="spellEnd"/>
       <w:r>
         <w:rPr>
           <w:rFonts w:ascii="Times New Roman" w:hAnsi="Times New Roman" w:cs="Times New Roman"/>
@@ -3276,8 +3680,18 @@
           <w:b/>
           <w:bCs/>
         </w:rPr>
-        <w:t>. SensitiveDetectionNode</w:t>
-      </w:r>
+        <w:t xml:space="preserve">. </w:t>
+      </w:r>
+      <w:proofErr w:type="spellStart"/>
+      <w:r>
+        <w:rPr>
+          <w:rFonts w:ascii="Times New Roman" w:hAnsi="Times New Roman" w:cs="Times New Roman"/>
+          <w:b/>
+          <w:bCs/>
+        </w:rPr>
+        <w:t>SensitiveDetectionNode</w:t>
+      </w:r>
+      <w:proofErr w:type="spellEnd"/>
     </w:p>
     <w:p>
       <w:pPr>
@@ -3432,19 +3846,22 @@
           <w:rFonts w:ascii="Times New Roman" w:hAnsi="Times New Roman" w:cs="Times New Roman"/>
         </w:rPr>
       </w:pPr>
+      <w:proofErr w:type="spellStart"/>
       <w:r>
         <w:rPr>
           <w:rFonts w:ascii="Times New Roman" w:hAnsi="Times New Roman" w:cs="Times New Roman"/>
         </w:rPr>
         <w:t>classified_files</w:t>
       </w:r>
-    </w:p>
-    <w:p>
-      <w:pPr>
-        <w:rPr>
-          <w:rFonts w:ascii="Times New Roman" w:hAnsi="Times New Roman" w:cs="Times New Roman"/>
-        </w:rPr>
-      </w:pPr>
+      <w:proofErr w:type="spellEnd"/>
+    </w:p>
+    <w:p>
+      <w:pPr>
+        <w:rPr>
+          <w:rFonts w:ascii="Times New Roman" w:hAnsi="Times New Roman" w:cs="Times New Roman"/>
+        </w:rPr>
+      </w:pPr>
+      <w:proofErr w:type="spellStart"/>
       <w:r>
         <w:rPr>
           <w:rFonts w:ascii="Times New Roman" w:hAnsi="Times New Roman" w:cs="Times New Roman"/>
@@ -3452,6 +3869,7 @@
         <w:lastRenderedPageBreak/>
         <w:t>duplicate_groups</w:t>
       </w:r>
+      <w:proofErr w:type="spellEnd"/>
     </w:p>
     <w:p>
       <w:pPr>
@@ -3502,11 +3920,33 @@
           <w:rFonts w:ascii="Times New Roman" w:hAnsi="Times New Roman" w:cs="Times New Roman"/>
         </w:rPr>
       </w:pPr>
-      <w:r>
-        <w:rPr>
-          <w:rFonts w:ascii="Times New Roman" w:hAnsi="Times New Roman" w:cs="Times New Roman"/>
-        </w:rPr>
-        <w:t>sensitive_files[]</w:t>
+      <w:proofErr w:type="spellStart"/>
+      <w:r>
+        <w:rPr>
+          <w:rFonts w:ascii="Times New Roman" w:hAnsi="Times New Roman" w:cs="Times New Roman"/>
+        </w:rPr>
+        <w:t>sensitive_</w:t>
+      </w:r>
+      <w:proofErr w:type="gramStart"/>
+      <w:r>
+        <w:rPr>
+          <w:rFonts w:ascii="Times New Roman" w:hAnsi="Times New Roman" w:cs="Times New Roman"/>
+        </w:rPr>
+        <w:t>files</w:t>
+      </w:r>
+      <w:proofErr w:type="spellEnd"/>
+      <w:r>
+        <w:rPr>
+          <w:rFonts w:ascii="Times New Roman" w:hAnsi="Times New Roman" w:cs="Times New Roman"/>
+        </w:rPr>
+        <w:t>[</w:t>
+      </w:r>
+      <w:proofErr w:type="gramEnd"/>
+      <w:r>
+        <w:rPr>
+          <w:rFonts w:ascii="Times New Roman" w:hAnsi="Times New Roman" w:cs="Times New Roman"/>
+        </w:rPr>
+        <w:t>]</w:t>
       </w:r>
     </w:p>
     <w:p>
@@ -3549,8 +3989,16 @@
         <w:rPr>
           <w:rFonts w:ascii="Times New Roman" w:hAnsi="Times New Roman" w:cs="Times New Roman"/>
         </w:rPr>
-        <w:t>→ OptimizationPlannerNode</w:t>
-      </w:r>
+        <w:t xml:space="preserve">→ </w:t>
+      </w:r>
+      <w:proofErr w:type="spellStart"/>
+      <w:r>
+        <w:rPr>
+          <w:rFonts w:ascii="Times New Roman" w:hAnsi="Times New Roman" w:cs="Times New Roman"/>
+        </w:rPr>
+        <w:t>OptimizationPlannerNode</w:t>
+      </w:r>
+      <w:proofErr w:type="spellEnd"/>
     </w:p>
     <w:p>
       <w:pPr>
@@ -3581,8 +4029,18 @@
           <w:b/>
           <w:bCs/>
         </w:rPr>
-        <w:t>. OptimizationPlannerNode</w:t>
-      </w:r>
+        <w:t xml:space="preserve">. </w:t>
+      </w:r>
+      <w:proofErr w:type="spellStart"/>
+      <w:r>
+        <w:rPr>
+          <w:rFonts w:ascii="Times New Roman" w:hAnsi="Times New Roman" w:cs="Times New Roman"/>
+          <w:b/>
+          <w:bCs/>
+        </w:rPr>
+        <w:t>OptimizationPlannerNode</w:t>
+      </w:r>
+      <w:proofErr w:type="spellEnd"/>
     </w:p>
     <w:p>
       <w:pPr>
@@ -3771,12 +4229,14 @@
           <w:rFonts w:ascii="Times New Roman" w:hAnsi="Times New Roman" w:cs="Times New Roman"/>
         </w:rPr>
       </w:pPr>
+      <w:proofErr w:type="spellStart"/>
       <w:r>
         <w:rPr>
           <w:rFonts w:ascii="Times New Roman" w:hAnsi="Times New Roman" w:cs="Times New Roman"/>
         </w:rPr>
         <w:t>classified_files</w:t>
       </w:r>
+      <w:proofErr w:type="spellEnd"/>
     </w:p>
     <w:p>
       <w:pPr>
@@ -3785,12 +4245,14 @@
           <w:rFonts w:ascii="Times New Roman" w:hAnsi="Times New Roman" w:cs="Times New Roman"/>
         </w:rPr>
       </w:pPr>
+      <w:proofErr w:type="spellStart"/>
       <w:r>
         <w:rPr>
           <w:rFonts w:ascii="Times New Roman" w:hAnsi="Times New Roman" w:cs="Times New Roman"/>
         </w:rPr>
         <w:t>duplicate_groups</w:t>
       </w:r>
+      <w:proofErr w:type="spellEnd"/>
     </w:p>
     <w:p>
       <w:pPr>
@@ -3799,12 +4261,14 @@
           <w:rFonts w:ascii="Times New Roman" w:hAnsi="Times New Roman" w:cs="Times New Roman"/>
         </w:rPr>
       </w:pPr>
+      <w:proofErr w:type="spellStart"/>
       <w:r>
         <w:rPr>
           <w:rFonts w:ascii="Times New Roman" w:hAnsi="Times New Roman" w:cs="Times New Roman"/>
         </w:rPr>
         <w:t>sensitive_files</w:t>
       </w:r>
+      <w:proofErr w:type="spellEnd"/>
     </w:p>
     <w:p>
       <w:pPr>
@@ -3813,12 +4277,14 @@
           <w:rFonts w:ascii="Times New Roman" w:hAnsi="Times New Roman" w:cs="Times New Roman"/>
         </w:rPr>
       </w:pPr>
+      <w:proofErr w:type="spellStart"/>
       <w:r>
         <w:rPr>
           <w:rFonts w:ascii="Times New Roman" w:hAnsi="Times New Roman" w:cs="Times New Roman"/>
         </w:rPr>
         <w:t>folder_scope_policy</w:t>
       </w:r>
+      <w:proofErr w:type="spellEnd"/>
     </w:p>
     <w:p>
       <w:pPr>
@@ -3870,11 +4336,19 @@
           <w:rFonts w:ascii="Times New Roman" w:hAnsi="Times New Roman" w:cs="Times New Roman"/>
         </w:rPr>
       </w:pPr>
-      <w:r>
-        <w:rPr>
-          <w:rFonts w:ascii="Times New Roman" w:hAnsi="Times New Roman" w:cs="Times New Roman"/>
-        </w:rPr>
-        <w:t>action_plan {</w:t>
+      <w:proofErr w:type="spellStart"/>
+      <w:r>
+        <w:rPr>
+          <w:rFonts w:ascii="Times New Roman" w:hAnsi="Times New Roman" w:cs="Times New Roman"/>
+        </w:rPr>
+        <w:t>action_plan</w:t>
+      </w:r>
+      <w:proofErr w:type="spellEnd"/>
+      <w:r>
+        <w:rPr>
+          <w:rFonts w:ascii="Times New Roman" w:hAnsi="Times New Roman" w:cs="Times New Roman"/>
+        </w:rPr>
+        <w:t xml:space="preserve"> {</w:t>
       </w:r>
     </w:p>
     <w:p>
@@ -3888,7 +4362,21 @@
         <w:rPr>
           <w:rFonts w:ascii="Times New Roman" w:hAnsi="Times New Roman" w:cs="Times New Roman"/>
         </w:rPr>
-        <w:t xml:space="preserve">  actions[],</w:t>
+        <w:t xml:space="preserve">  </w:t>
+      </w:r>
+      <w:proofErr w:type="gramStart"/>
+      <w:r>
+        <w:rPr>
+          <w:rFonts w:ascii="Times New Roman" w:hAnsi="Times New Roman" w:cs="Times New Roman"/>
+        </w:rPr>
+        <w:t>actions[</w:t>
+      </w:r>
+      <w:proofErr w:type="gramEnd"/>
+      <w:r>
+        <w:rPr>
+          <w:rFonts w:ascii="Times New Roman" w:hAnsi="Times New Roman" w:cs="Times New Roman"/>
+        </w:rPr>
+        <w:t>],</w:t>
       </w:r>
     </w:p>
     <w:p>
@@ -3902,7 +4390,21 @@
         <w:rPr>
           <w:rFonts w:ascii="Times New Roman" w:hAnsi="Times New Roman" w:cs="Times New Roman"/>
         </w:rPr>
-        <w:t xml:space="preserve">  reasoning[],</w:t>
+        <w:t xml:space="preserve">  </w:t>
+      </w:r>
+      <w:proofErr w:type="gramStart"/>
+      <w:r>
+        <w:rPr>
+          <w:rFonts w:ascii="Times New Roman" w:hAnsi="Times New Roman" w:cs="Times New Roman"/>
+        </w:rPr>
+        <w:t>reasoning[</w:t>
+      </w:r>
+      <w:proofErr w:type="gramEnd"/>
+      <w:r>
+        <w:rPr>
+          <w:rFonts w:ascii="Times New Roman" w:hAnsi="Times New Roman" w:cs="Times New Roman"/>
+        </w:rPr>
+        <w:t>],</w:t>
       </w:r>
     </w:p>
     <w:p>
@@ -3917,8 +4419,16 @@
           <w:rFonts w:ascii="Times New Roman" w:hAnsi="Times New Roman" w:cs="Times New Roman"/>
         </w:rPr>
         <w:lastRenderedPageBreak/>
-        <w:t xml:space="preserve">  estimated_recovery</w:t>
-      </w:r>
+        <w:t xml:space="preserve">  </w:t>
+      </w:r>
+      <w:proofErr w:type="spellStart"/>
+      <w:r>
+        <w:rPr>
+          <w:rFonts w:ascii="Times New Roman" w:hAnsi="Times New Roman" w:cs="Times New Roman"/>
+        </w:rPr>
+        <w:t>estimated_recovery</w:t>
+      </w:r>
+      <w:proofErr w:type="spellEnd"/>
     </w:p>
     <w:p>
       <w:pPr>
@@ -3974,8 +4484,16 @@
         <w:rPr>
           <w:rFonts w:ascii="Times New Roman" w:hAnsi="Times New Roman" w:cs="Times New Roman"/>
         </w:rPr>
-        <w:t>→ HITLApprovalNode</w:t>
-      </w:r>
+        <w:t xml:space="preserve">→ </w:t>
+      </w:r>
+      <w:proofErr w:type="spellStart"/>
+      <w:r>
+        <w:rPr>
+          <w:rFonts w:ascii="Times New Roman" w:hAnsi="Times New Roman" w:cs="Times New Roman"/>
+        </w:rPr>
+        <w:t>HITLApprovalNode</w:t>
+      </w:r>
+      <w:proofErr w:type="spellEnd"/>
     </w:p>
     <w:p>
       <w:pPr>
@@ -4006,8 +4524,18 @@
           <w:b/>
           <w:bCs/>
         </w:rPr>
-        <w:t>. HITLApprovalNode</w:t>
-      </w:r>
+        <w:t xml:space="preserve">. </w:t>
+      </w:r>
+      <w:proofErr w:type="spellStart"/>
+      <w:r>
+        <w:rPr>
+          <w:rFonts w:ascii="Times New Roman" w:hAnsi="Times New Roman" w:cs="Times New Roman"/>
+          <w:b/>
+          <w:bCs/>
+        </w:rPr>
+        <w:t>HITLApprovalNode</w:t>
+      </w:r>
+      <w:proofErr w:type="spellEnd"/>
     </w:p>
     <w:p>
       <w:pPr>
@@ -4146,12 +4674,14 @@
           <w:rFonts w:ascii="Times New Roman" w:hAnsi="Times New Roman" w:cs="Times New Roman"/>
         </w:rPr>
       </w:pPr>
+      <w:proofErr w:type="spellStart"/>
       <w:r>
         <w:rPr>
           <w:rFonts w:ascii="Times New Roman" w:hAnsi="Times New Roman" w:cs="Times New Roman"/>
         </w:rPr>
         <w:t>action_plan</w:t>
       </w:r>
+      <w:proofErr w:type="spellEnd"/>
     </w:p>
     <w:p>
       <w:pPr>
@@ -4202,11 +4732,33 @@
           <w:rFonts w:ascii="Times New Roman" w:hAnsi="Times New Roman" w:cs="Times New Roman"/>
         </w:rPr>
       </w:pPr>
-      <w:r>
-        <w:rPr>
-          <w:rFonts w:ascii="Times New Roman" w:hAnsi="Times New Roman" w:cs="Times New Roman"/>
-        </w:rPr>
-        <w:t>approved_actions[]</w:t>
+      <w:proofErr w:type="spellStart"/>
+      <w:r>
+        <w:rPr>
+          <w:rFonts w:ascii="Times New Roman" w:hAnsi="Times New Roman" w:cs="Times New Roman"/>
+        </w:rPr>
+        <w:t>approved_</w:t>
+      </w:r>
+      <w:proofErr w:type="gramStart"/>
+      <w:r>
+        <w:rPr>
+          <w:rFonts w:ascii="Times New Roman" w:hAnsi="Times New Roman" w:cs="Times New Roman"/>
+        </w:rPr>
+        <w:t>actions</w:t>
+      </w:r>
+      <w:proofErr w:type="spellEnd"/>
+      <w:r>
+        <w:rPr>
+          <w:rFonts w:ascii="Times New Roman" w:hAnsi="Times New Roman" w:cs="Times New Roman"/>
+        </w:rPr>
+        <w:t>[</w:t>
+      </w:r>
+      <w:proofErr w:type="gramEnd"/>
+      <w:r>
+        <w:rPr>
+          <w:rFonts w:ascii="Times New Roman" w:hAnsi="Times New Roman" w:cs="Times New Roman"/>
+        </w:rPr>
+        <w:t>]</w:t>
       </w:r>
     </w:p>
     <w:p>
@@ -4249,8 +4801,30 @@
         <w:rPr>
           <w:rFonts w:ascii="Times New Roman" w:hAnsi="Times New Roman" w:cs="Times New Roman"/>
         </w:rPr>
-        <w:t>If approved → ExecutionNode If rejected → SummaryNode</w:t>
-      </w:r>
+        <w:t xml:space="preserve">If approved → </w:t>
+      </w:r>
+      <w:proofErr w:type="spellStart"/>
+      <w:r>
+        <w:rPr>
+          <w:rFonts w:ascii="Times New Roman" w:hAnsi="Times New Roman" w:cs="Times New Roman"/>
+        </w:rPr>
+        <w:t>ExecutionNode</w:t>
+      </w:r>
+      <w:proofErr w:type="spellEnd"/>
+      <w:r>
+        <w:rPr>
+          <w:rFonts w:ascii="Times New Roman" w:hAnsi="Times New Roman" w:cs="Times New Roman"/>
+        </w:rPr>
+        <w:t xml:space="preserve"> If rejected → </w:t>
+      </w:r>
+      <w:proofErr w:type="spellStart"/>
+      <w:r>
+        <w:rPr>
+          <w:rFonts w:ascii="Times New Roman" w:hAnsi="Times New Roman" w:cs="Times New Roman"/>
+        </w:rPr>
+        <w:t>SummaryNode</w:t>
+      </w:r>
+      <w:proofErr w:type="spellEnd"/>
       <w:r>
         <w:rPr>
           <w:rFonts w:ascii="Times New Roman" w:hAnsi="Times New Roman" w:cs="Times New Roman"/>
@@ -4293,8 +4867,18 @@
           <w:b/>
           <w:bCs/>
         </w:rPr>
-        <w:t>. ExecutionNode</w:t>
-      </w:r>
+        <w:t xml:space="preserve">. </w:t>
+      </w:r>
+      <w:proofErr w:type="spellStart"/>
+      <w:r>
+        <w:rPr>
+          <w:rFonts w:ascii="Times New Roman" w:hAnsi="Times New Roman" w:cs="Times New Roman"/>
+          <w:b/>
+          <w:bCs/>
+        </w:rPr>
+        <w:t>ExecutionNode</w:t>
+      </w:r>
+      <w:proofErr w:type="spellEnd"/>
     </w:p>
     <w:p>
       <w:pPr>
@@ -4488,12 +5072,14 @@
           <w:rFonts w:ascii="Times New Roman" w:hAnsi="Times New Roman" w:cs="Times New Roman"/>
         </w:rPr>
       </w:pPr>
+      <w:proofErr w:type="spellStart"/>
       <w:r>
         <w:rPr>
           <w:rFonts w:ascii="Times New Roman" w:hAnsi="Times New Roman" w:cs="Times New Roman"/>
         </w:rPr>
         <w:t>approved_actions</w:t>
       </w:r>
+      <w:proofErr w:type="spellEnd"/>
     </w:p>
     <w:p>
       <w:pPr>
@@ -4544,11 +5130,33 @@
           <w:rFonts w:ascii="Times New Roman" w:hAnsi="Times New Roman" w:cs="Times New Roman"/>
         </w:rPr>
       </w:pPr>
-      <w:r>
-        <w:rPr>
-          <w:rFonts w:ascii="Times New Roman" w:hAnsi="Times New Roman" w:cs="Times New Roman"/>
-        </w:rPr>
-        <w:t>execution_log[]</w:t>
+      <w:proofErr w:type="spellStart"/>
+      <w:r>
+        <w:rPr>
+          <w:rFonts w:ascii="Times New Roman" w:hAnsi="Times New Roman" w:cs="Times New Roman"/>
+        </w:rPr>
+        <w:t>execution_</w:t>
+      </w:r>
+      <w:proofErr w:type="gramStart"/>
+      <w:r>
+        <w:rPr>
+          <w:rFonts w:ascii="Times New Roman" w:hAnsi="Times New Roman" w:cs="Times New Roman"/>
+        </w:rPr>
+        <w:t>log</w:t>
+      </w:r>
+      <w:proofErr w:type="spellEnd"/>
+      <w:r>
+        <w:rPr>
+          <w:rFonts w:ascii="Times New Roman" w:hAnsi="Times New Roman" w:cs="Times New Roman"/>
+        </w:rPr>
+        <w:t>[</w:t>
+      </w:r>
+      <w:proofErr w:type="gramEnd"/>
+      <w:r>
+        <w:rPr>
+          <w:rFonts w:ascii="Times New Roman" w:hAnsi="Times New Roman" w:cs="Times New Roman"/>
+        </w:rPr>
+        <w:t>]</w:t>
       </w:r>
       <w:r>
         <w:rPr>
@@ -4587,8 +5195,16 @@
         <w:rPr>
           <w:rFonts w:ascii="Times New Roman" w:hAnsi="Times New Roman" w:cs="Times New Roman"/>
         </w:rPr>
-        <w:t>→ SummaryNode</w:t>
-      </w:r>
+        <w:t xml:space="preserve">→ </w:t>
+      </w:r>
+      <w:proofErr w:type="spellStart"/>
+      <w:r>
+        <w:rPr>
+          <w:rFonts w:ascii="Times New Roman" w:hAnsi="Times New Roman" w:cs="Times New Roman"/>
+        </w:rPr>
+        <w:t>SummaryNode</w:t>
+      </w:r>
+      <w:proofErr w:type="spellEnd"/>
     </w:p>
     <w:p>
       <w:pPr>
@@ -4621,8 +5237,18 @@
           <w:b/>
           <w:bCs/>
         </w:rPr>
-        <w:t>. RollbackNode</w:t>
-      </w:r>
+        <w:t xml:space="preserve">. </w:t>
+      </w:r>
+      <w:proofErr w:type="spellStart"/>
+      <w:r>
+        <w:rPr>
+          <w:rFonts w:ascii="Times New Roman" w:hAnsi="Times New Roman" w:cs="Times New Roman"/>
+          <w:b/>
+          <w:bCs/>
+        </w:rPr>
+        <w:t>RollbackNode</w:t>
+      </w:r>
+      <w:proofErr w:type="spellEnd"/>
     </w:p>
     <w:p>
       <w:pPr>
@@ -4758,12 +5384,14 @@
           <w:rFonts w:ascii="Times New Roman" w:hAnsi="Times New Roman" w:cs="Times New Roman"/>
         </w:rPr>
       </w:pPr>
+      <w:proofErr w:type="spellStart"/>
       <w:r>
         <w:rPr>
           <w:rFonts w:ascii="Times New Roman" w:hAnsi="Times New Roman" w:cs="Times New Roman"/>
         </w:rPr>
         <w:t>execution_log</w:t>
       </w:r>
+      <w:proofErr w:type="spellEnd"/>
     </w:p>
     <w:p>
       <w:pPr>
@@ -4841,12 +5469,14 @@
           <w:rFonts w:ascii="Times New Roman" w:hAnsi="Times New Roman" w:cs="Times New Roman"/>
         </w:rPr>
       </w:pPr>
+      <w:proofErr w:type="spellStart"/>
       <w:r>
         <w:rPr>
           <w:rFonts w:ascii="Times New Roman" w:hAnsi="Times New Roman" w:cs="Times New Roman"/>
         </w:rPr>
         <w:t>rollback_status</w:t>
       </w:r>
+      <w:proofErr w:type="spellEnd"/>
       <w:r>
         <w:rPr>
           <w:rFonts w:ascii="Times New Roman" w:hAnsi="Times New Roman" w:cs="Times New Roman"/>
@@ -4882,8 +5512,16 @@
         <w:rPr>
           <w:rFonts w:ascii="Times New Roman" w:hAnsi="Times New Roman" w:cs="Times New Roman"/>
         </w:rPr>
-        <w:t>→ SummaryNode</w:t>
-      </w:r>
+        <w:t xml:space="preserve">→ </w:t>
+      </w:r>
+      <w:proofErr w:type="spellStart"/>
+      <w:r>
+        <w:rPr>
+          <w:rFonts w:ascii="Times New Roman" w:hAnsi="Times New Roman" w:cs="Times New Roman"/>
+        </w:rPr>
+        <w:t>SummaryNode</w:t>
+      </w:r>
+      <w:proofErr w:type="spellEnd"/>
     </w:p>
     <w:p>
       <w:pPr>
@@ -4929,8 +5567,18 @@
           <w:b/>
           <w:bCs/>
         </w:rPr>
-        <w:t>. SummaryNode</w:t>
-      </w:r>
+        <w:t xml:space="preserve">. </w:t>
+      </w:r>
+      <w:proofErr w:type="spellStart"/>
+      <w:r>
+        <w:rPr>
+          <w:rFonts w:ascii="Times New Roman" w:hAnsi="Times New Roman" w:cs="Times New Roman"/>
+          <w:b/>
+          <w:bCs/>
+        </w:rPr>
+        <w:t>SummaryNode</w:t>
+      </w:r>
+      <w:proofErr w:type="spellEnd"/>
     </w:p>
     <w:p>
       <w:pPr>
@@ -5053,6 +5701,153 @@
     </w:p>
     <w:p>
       <w:pPr>
+        <w:spacing w:before="100" w:beforeAutospacing="1" w:after="100" w:afterAutospacing="1" w:line="240" w:lineRule="auto"/>
+        <w:ind w:left="720"/>
+        <w:outlineLvl w:val="2"/>
+        <w:rPr>
+          <w:rFonts w:ascii="Times New Roman" w:eastAsia="Times New Roman" w:hAnsi="Times New Roman" w:cs="Times New Roman"/>
+          <w:b/>
+          <w:bCs/>
+          <w:kern w:val="0"/>
+          <w:sz w:val="27"/>
+          <w:szCs w:val="27"/>
+          <w14:ligatures w14:val="none"/>
+        </w:rPr>
+      </w:pPr>
+      <w:r>
+        <w:rPr>
+          <w:rFonts w:ascii="Times New Roman" w:eastAsia="Times New Roman" w:hAnsi="Times New Roman" w:cs="Times New Roman"/>
+          <w:b/>
+          <w:bCs/>
+          <w:kern w:val="0"/>
+          <w:sz w:val="27"/>
+          <w:szCs w:val="27"/>
+          <w14:ligatures w14:val="none"/>
+        </w:rPr>
+        <w:t>Refinement</w:t>
+      </w:r>
+    </w:p>
+    <w:p>
+      <w:pPr>
+        <w:pStyle w:val="ListParagraph"/>
+        <w:numPr>
+          <w:ilvl w:val="0"/>
+          <w:numId w:val="35"/>
+        </w:numPr>
+        <w:spacing w:before="100" w:beforeAutospacing="1" w:after="100" w:afterAutospacing="1" w:line="240" w:lineRule="auto"/>
+        <w:rPr>
+          <w:rFonts w:ascii="Times New Roman" w:eastAsia="Times New Roman" w:hAnsi="Times New Roman" w:cs="Times New Roman"/>
+          <w:kern w:val="0"/>
+          <w14:ligatures w14:val="none"/>
+        </w:rPr>
+      </w:pPr>
+      <w:r>
+        <w:rPr>
+          <w:rFonts w:ascii="Segoe UI Emoji" w:eastAsia="Times New Roman" w:hAnsi="Segoe UI Emoji" w:cs="Segoe UI Emoji"/>
+          <w:kern w:val="0"/>
+          <w14:ligatures w14:val="none"/>
+        </w:rPr>
+        <w:t>I</w:t>
+      </w:r>
+      <w:r>
+        <w:rPr>
+          <w:rFonts w:ascii="Times New Roman" w:eastAsia="Times New Roman" w:hAnsi="Times New Roman" w:cs="Times New Roman"/>
+          <w:kern w:val="0"/>
+          <w14:ligatures w14:val="none"/>
+        </w:rPr>
+        <w:t xml:space="preserve">nclude a </w:t>
+      </w:r>
+      <w:r>
+        <w:rPr>
+          <w:rFonts w:ascii="Times New Roman" w:eastAsia="Times New Roman" w:hAnsi="Times New Roman" w:cs="Times New Roman"/>
+          <w:b/>
+          <w:bCs/>
+          <w:kern w:val="0"/>
+          <w14:ligatures w14:val="none"/>
+        </w:rPr>
+        <w:t>human-readable report</w:t>
+      </w:r>
+      <w:r>
+        <w:rPr>
+          <w:rFonts w:ascii="Times New Roman" w:eastAsia="Times New Roman" w:hAnsi="Times New Roman" w:cs="Times New Roman"/>
+          <w:kern w:val="0"/>
+          <w14:ligatures w14:val="none"/>
+        </w:rPr>
+        <w:t xml:space="preserve"> that the UI can display directly.</w:t>
+      </w:r>
+    </w:p>
+    <w:p>
+      <w:pPr>
+        <w:pStyle w:val="ListParagraph"/>
+        <w:numPr>
+          <w:ilvl w:val="0"/>
+          <w:numId w:val="35"/>
+        </w:numPr>
+        <w:spacing w:before="100" w:beforeAutospacing="1" w:after="100" w:afterAutospacing="1" w:line="240" w:lineRule="auto"/>
+        <w:rPr>
+          <w:rFonts w:ascii="Times New Roman" w:eastAsia="Times New Roman" w:hAnsi="Times New Roman" w:cs="Times New Roman"/>
+          <w:kern w:val="0"/>
+          <w14:ligatures w14:val="none"/>
+        </w:rPr>
+      </w:pPr>
+      <w:proofErr w:type="spellStart"/>
+      <w:r>
+        <w:rPr>
+          <w:rFonts w:ascii="Times New Roman" w:eastAsia="Times New Roman" w:hAnsi="Times New Roman" w:cs="Times New Roman"/>
+          <w:b/>
+          <w:bCs/>
+          <w:kern w:val="0"/>
+          <w14:ligatures w14:val="none"/>
+        </w:rPr>
+        <w:t>SummaryNode</w:t>
+      </w:r>
+      <w:proofErr w:type="spellEnd"/>
+      <w:r>
+        <w:rPr>
+          <w:rFonts w:ascii="Times New Roman" w:eastAsia="Times New Roman" w:hAnsi="Times New Roman" w:cs="Times New Roman"/>
+          <w:b/>
+          <w:bCs/>
+          <w:kern w:val="0"/>
+          <w14:ligatures w14:val="none"/>
+        </w:rPr>
+        <w:t xml:space="preserve"> must not attempt to re-execute or modify anything.</w:t>
+      </w:r>
+      <w:r>
+        <w:rPr>
+          <w:rFonts w:ascii="Times New Roman" w:eastAsia="Times New Roman" w:hAnsi="Times New Roman" w:cs="Times New Roman"/>
+          <w:kern w:val="0"/>
+          <w14:ligatures w14:val="none"/>
+        </w:rPr>
+        <w:t xml:space="preserve"> It is a </w:t>
+      </w:r>
+      <w:r>
+        <w:rPr>
+          <w:rFonts w:ascii="Times New Roman" w:eastAsia="Times New Roman" w:hAnsi="Times New Roman" w:cs="Times New Roman"/>
+          <w:i/>
+          <w:iCs/>
+          <w:kern w:val="0"/>
+          <w14:ligatures w14:val="none"/>
+        </w:rPr>
+        <w:t>pure reporting node</w:t>
+      </w:r>
+      <w:r>
+        <w:rPr>
+          <w:rFonts w:ascii="Times New Roman" w:eastAsia="Times New Roman" w:hAnsi="Times New Roman" w:cs="Times New Roman"/>
+          <w:kern w:val="0"/>
+          <w14:ligatures w14:val="none"/>
+        </w:rPr>
+        <w:t>.</w:t>
+      </w:r>
+    </w:p>
+    <w:p>
+      <w:pPr>
+        <w:rPr>
+          <w:rFonts w:ascii="Times New Roman" w:hAnsi="Times New Roman" w:cs="Times New Roman"/>
+        </w:rPr>
+      </w:pPr>
+    </w:p>
+    <w:p>
+      <w:pPr>
         <w:rPr>
           <w:rFonts w:ascii="Times New Roman" w:hAnsi="Times New Roman" w:cs="Times New Roman"/>
           <w:b/>
@@ -5087,12 +5882,14 @@
           <w:rFonts w:ascii="Times New Roman" w:hAnsi="Times New Roman" w:cs="Times New Roman"/>
         </w:rPr>
       </w:pPr>
+      <w:proofErr w:type="spellStart"/>
       <w:r>
         <w:rPr>
           <w:rFonts w:ascii="Times New Roman" w:hAnsi="Times New Roman" w:cs="Times New Roman"/>
         </w:rPr>
         <w:t>execution_log</w:t>
       </w:r>
+      <w:proofErr w:type="spellEnd"/>
     </w:p>
     <w:p>
       <w:pPr>
@@ -5134,6 +5931,7 @@
         <w:rPr>
           <w:rFonts w:ascii="Times New Roman" w:hAnsi="Times New Roman" w:cs="Times New Roman"/>
         </w:rPr>
+        <w:lastRenderedPageBreak/>
         <w:t>```</w:t>
       </w:r>
     </w:p>
@@ -5143,12 +5941,14 @@
           <w:rFonts w:ascii="Times New Roman" w:hAnsi="Times New Roman" w:cs="Times New Roman"/>
         </w:rPr>
       </w:pPr>
+      <w:proofErr w:type="spellStart"/>
       <w:r>
         <w:rPr>
           <w:rFonts w:ascii="Times New Roman" w:hAnsi="Times New Roman" w:cs="Times New Roman"/>
         </w:rPr>
         <w:t>summary_report</w:t>
       </w:r>
+      <w:proofErr w:type="spellEnd"/>
     </w:p>
     <w:p>
       <w:pPr>
@@ -5223,8 +6023,18 @@
           <w:b/>
           <w:bCs/>
         </w:rPr>
-        <w:t>12. WeeklyOrganizerNode</w:t>
-      </w:r>
+        <w:t xml:space="preserve">12. </w:t>
+      </w:r>
+      <w:proofErr w:type="spellStart"/>
+      <w:r>
+        <w:rPr>
+          <w:rFonts w:ascii="Times New Roman" w:hAnsi="Times New Roman" w:cs="Times New Roman"/>
+          <w:b/>
+          <w:bCs/>
+        </w:rPr>
+        <w:t>WeeklyOrganizerNode</w:t>
+      </w:r>
+      <w:proofErr w:type="spellEnd"/>
       <w:r>
         <w:rPr>
           <w:rFonts w:ascii="Times New Roman" w:hAnsi="Times New Roman" w:cs="Times New Roman"/>
@@ -5253,16 +6063,238 @@
     </w:p>
     <w:p>
       <w:pPr>
-        <w:rPr>
-          <w:rFonts w:ascii="Times New Roman" w:hAnsi="Times New Roman" w:cs="Times New Roman"/>
-        </w:rPr>
-      </w:pPr>
-      <w:r>
-        <w:rPr>
-          <w:rFonts w:ascii="Times New Roman" w:hAnsi="Times New Roman" w:cs="Times New Roman"/>
-        </w:rPr>
+        <w:pStyle w:val="NoSpacing"/>
+      </w:pPr>
+      <w:r>
+        <w:rPr>
+          <w:rFonts w:ascii="Segoe UI Symbol" w:hAnsi="Segoe UI Symbol" w:cs="Segoe UI Symbol"/>
+        </w:rPr>
+        <w:t>✔</w:t>
+      </w:r>
+      <w:r>
         <w:t>Automated weekly cleanup.</w:t>
       </w:r>
+    </w:p>
+    <w:p>
+      <w:pPr>
+        <w:pStyle w:val="NoSpacing"/>
+      </w:pPr>
+      <w:r>
+        <w:rPr>
+          <w:rFonts w:ascii="Segoe UI Symbol" w:hAnsi="Segoe UI Symbol" w:cs="Segoe UI Symbol"/>
+        </w:rPr>
+        <w:t>✔</w:t>
+      </w:r>
+      <w:r>
+        <w:t>Pub/Sub automation rules</w:t>
+      </w:r>
+    </w:p>
+    <w:p>
+      <w:pPr>
+        <w:pStyle w:val="NoSpacing"/>
+      </w:pPr>
+      <w:r>
+        <w:rPr>
+          <w:rFonts w:ascii="Segoe UI Symbol" w:hAnsi="Segoe UI Symbol" w:cs="Segoe UI Symbol"/>
+        </w:rPr>
+        <w:t>✔</w:t>
+      </w:r>
+      <w:r>
+        <w:t xml:space="preserve"> Safety model</w:t>
+      </w:r>
+    </w:p>
+    <w:p>
+      <w:pPr>
+        <w:pStyle w:val="NoSpacing"/>
+      </w:pPr>
+      <w:r>
+        <w:rPr>
+          <w:rFonts w:ascii="Segoe UI Symbol" w:hAnsi="Segoe UI Symbol" w:cs="Segoe UI Symbol"/>
+        </w:rPr>
+        <w:t>✔</w:t>
+      </w:r>
+      <w:r>
+        <w:t xml:space="preserve"> Sensitive file protection</w:t>
+      </w:r>
+      <w:r>
+        <w:t>:</w:t>
+      </w:r>
+    </w:p>
+    <w:p>
+      <w:pPr>
+        <w:pStyle w:val="NoSpacing"/>
+        <w:numPr>
+          <w:ilvl w:val="1"/>
+          <w:numId w:val="50"/>
+        </w:numPr>
+      </w:pPr>
+      <w:r>
+        <w:rPr>
+          <w:rFonts w:ascii="Segoe UI Symbol" w:hAnsi="Segoe UI Symbol" w:cs="Segoe UI Symbol"/>
+        </w:rPr>
+        <w:t>✔</w:t>
+      </w:r>
+      <w:r>
+        <w:t xml:space="preserve"> Sensitive files must be moved to the Authenticated folder</w:t>
+      </w:r>
+    </w:p>
+    <w:p>
+      <w:pPr>
+        <w:pStyle w:val="NoSpacing"/>
+        <w:numPr>
+          <w:ilvl w:val="1"/>
+          <w:numId w:val="50"/>
+        </w:numPr>
+      </w:pPr>
+      <w:r>
+        <w:rPr>
+          <w:rFonts w:ascii="Segoe UI Symbol" w:hAnsi="Segoe UI Symbol" w:cs="Segoe UI Symbol"/>
+        </w:rPr>
+        <w:t>✔</w:t>
+      </w:r>
+      <w:r>
+        <w:t xml:space="preserve"> Sensitive files must NOT be skipped</w:t>
+      </w:r>
+    </w:p>
+    <w:p>
+      <w:pPr>
+        <w:pStyle w:val="NoSpacing"/>
+        <w:numPr>
+          <w:ilvl w:val="1"/>
+          <w:numId w:val="50"/>
+        </w:numPr>
+      </w:pPr>
+      <w:r>
+        <w:rPr>
+          <w:rFonts w:ascii="Segoe UI Symbol" w:hAnsi="Segoe UI Symbol" w:cs="Segoe UI Symbol"/>
+        </w:rPr>
+        <w:t>✔</w:t>
+      </w:r>
+      <w:r>
+        <w:t xml:space="preserve"> Sensitive files must NOT be archived</w:t>
+      </w:r>
+    </w:p>
+    <w:p>
+      <w:pPr>
+        <w:pStyle w:val="NoSpacing"/>
+        <w:numPr>
+          <w:ilvl w:val="1"/>
+          <w:numId w:val="50"/>
+        </w:numPr>
+      </w:pPr>
+      <w:r>
+        <w:rPr>
+          <w:rFonts w:ascii="Segoe UI Symbol" w:hAnsi="Segoe UI Symbol" w:cs="Segoe UI Symbol"/>
+        </w:rPr>
+        <w:t>✔</w:t>
+      </w:r>
+      <w:r>
+        <w:t xml:space="preserve"> Sensitive files must NOT be deleted (safe mode already prevents this)</w:t>
+      </w:r>
+    </w:p>
+    <w:p>
+      <w:pPr>
+        <w:pStyle w:val="NoSpacing"/>
+        <w:numPr>
+          <w:ilvl w:val="1"/>
+          <w:numId w:val="50"/>
+        </w:numPr>
+      </w:pPr>
+      <w:r>
+        <w:rPr>
+          <w:rFonts w:ascii="Segoe UI Symbol" w:hAnsi="Segoe UI Symbol" w:cs="Segoe UI Symbol"/>
+        </w:rPr>
+        <w:t>✔</w:t>
+      </w:r>
+      <w:r>
+        <w:t xml:space="preserve"> Sensitive files must be included in the weekly summary as “protected”</w:t>
+      </w:r>
+    </w:p>
+    <w:p>
+      <w:pPr>
+        <w:pStyle w:val="NoSpacing"/>
+      </w:pPr>
+    </w:p>
+    <w:p>
+      <w:pPr>
+        <w:pStyle w:val="NoSpacing"/>
+      </w:pPr>
+      <w:r>
+        <w:rPr>
+          <w:rFonts w:ascii="Segoe UI Symbol" w:hAnsi="Segoe UI Symbol" w:cs="Segoe UI Symbol"/>
+        </w:rPr>
+        <w:t>✔</w:t>
+      </w:r>
+      <w:r>
+        <w:t xml:space="preserve"> Blocked/system path protection</w:t>
+      </w:r>
+    </w:p>
+    <w:p>
+      <w:pPr>
+        <w:pStyle w:val="NoSpacing"/>
+      </w:pPr>
+      <w:r>
+        <w:rPr>
+          <w:rFonts w:ascii="Segoe UI Symbol" w:hAnsi="Segoe UI Symbol" w:cs="Segoe UI Symbol"/>
+        </w:rPr>
+        <w:t>✔</w:t>
+      </w:r>
+      <w:r>
+        <w:t xml:space="preserve"> User enable/disable toggle</w:t>
+      </w:r>
+    </w:p>
+    <w:p>
+      <w:pPr>
+        <w:pStyle w:val="NoSpacing"/>
+      </w:pPr>
+      <w:r>
+        <w:rPr>
+          <w:rFonts w:ascii="Segoe UI Symbol" w:hAnsi="Segoe UI Symbol" w:cs="Segoe UI Symbol"/>
+        </w:rPr>
+        <w:t>✔</w:t>
+      </w:r>
+      <w:r>
+        <w:t xml:space="preserve"> Safe</w:t>
+      </w:r>
+      <w:r>
+        <w:noBreakHyphen/>
+        <w:t>mode execution (no deletes)</w:t>
+      </w:r>
+    </w:p>
+    <w:p>
+      <w:pPr>
+        <w:pStyle w:val="NoSpacing"/>
+      </w:pPr>
+      <w:r>
+        <w:rPr>
+          <w:rFonts w:ascii="Segoe UI Symbol" w:hAnsi="Segoe UI Symbol" w:cs="Segoe UI Symbol"/>
+        </w:rPr>
+        <w:t>✔</w:t>
+      </w:r>
+      <w:r>
+        <w:t xml:space="preserve"> Proper graph transitions</w:t>
+      </w:r>
+    </w:p>
+    <w:p>
+      <w:pPr>
+        <w:pStyle w:val="NoSpacing"/>
+      </w:pPr>
+      <w:r>
+        <w:rPr>
+          <w:rFonts w:ascii="Segoe UI Symbol" w:hAnsi="Segoe UI Symbol" w:cs="Segoe UI Symbol"/>
+        </w:rPr>
+        <w:t>✔</w:t>
+      </w:r>
+      <w:r>
+        <w:t xml:space="preserve"> Isolation from the main cleanup workflow</w:t>
+      </w:r>
+    </w:p>
+    <w:p>
+      <w:pPr>
+        <w:rPr>
+          <w:rFonts w:ascii="Times New Roman" w:hAnsi="Times New Roman" w:cs="Times New Roman"/>
+        </w:rPr>
+      </w:pPr>
     </w:p>
     <w:p>
       <w:pPr>
@@ -5404,6 +6436,7 @@
           <w:b/>
           <w:bCs/>
         </w:rPr>
+        <w:lastRenderedPageBreak/>
         <w:t>```</w:t>
       </w:r>
     </w:p>
@@ -5534,7 +6567,21 @@
         <w:rPr>
           <w:rFonts w:ascii="Times New Roman" w:hAnsi="Times New Roman" w:cs="Times New Roman"/>
         </w:rPr>
-        <w:t xml:space="preserve">→ FileDiscoveryNode </w:t>
+        <w:t xml:space="preserve">→ </w:t>
+      </w:r>
+      <w:proofErr w:type="spellStart"/>
+      <w:r>
+        <w:rPr>
+          <w:rFonts w:ascii="Times New Roman" w:hAnsi="Times New Roman" w:cs="Times New Roman"/>
+        </w:rPr>
+        <w:t>FileDiscoveryNode</w:t>
+      </w:r>
+      <w:proofErr w:type="spellEnd"/>
+      <w:r>
+        <w:rPr>
+          <w:rFonts w:ascii="Times New Roman" w:hAnsi="Times New Roman" w:cs="Times New Roman"/>
+        </w:rPr>
+        <w:t xml:space="preserve"> </w:t>
       </w:r>
       <w:r>
         <w:rPr>
@@ -5603,7 +6650,6 @@
           <w:b/>
           <w:bCs/>
         </w:rPr>
-        <w:lastRenderedPageBreak/>
         <w:t>5. Graph Flow (How Nodes Connect)</w:t>
       </w:r>
     </w:p>
@@ -5649,12 +6695,14 @@
           <w:rFonts w:ascii="Times New Roman" w:hAnsi="Times New Roman" w:cs="Times New Roman"/>
         </w:rPr>
       </w:pPr>
+      <w:proofErr w:type="spellStart"/>
       <w:r>
         <w:rPr>
           <w:rFonts w:ascii="Times New Roman" w:hAnsi="Times New Roman" w:cs="Times New Roman"/>
         </w:rPr>
         <w:t>MyPCAssistantNode</w:t>
       </w:r>
+      <w:proofErr w:type="spellEnd"/>
     </w:p>
     <w:p>
       <w:pPr>
@@ -5679,12 +6727,14 @@
           <w:rFonts w:ascii="Times New Roman" w:hAnsi="Times New Roman" w:cs="Times New Roman"/>
         </w:rPr>
       </w:pPr>
+      <w:proofErr w:type="spellStart"/>
       <w:r>
         <w:rPr>
           <w:rFonts w:ascii="Times New Roman" w:hAnsi="Times New Roman" w:cs="Times New Roman"/>
         </w:rPr>
         <w:t>FolderScopeNode</w:t>
       </w:r>
+      <w:proofErr w:type="spellEnd"/>
     </w:p>
     <w:p>
       <w:pPr>
@@ -5709,12 +6759,14 @@
           <w:rFonts w:ascii="Times New Roman" w:hAnsi="Times New Roman" w:cs="Times New Roman"/>
         </w:rPr>
       </w:pPr>
+      <w:proofErr w:type="spellStart"/>
       <w:r>
         <w:rPr>
           <w:rFonts w:ascii="Times New Roman" w:hAnsi="Times New Roman" w:cs="Times New Roman"/>
         </w:rPr>
         <w:t>FileDiscoveryNode</w:t>
       </w:r>
+      <w:proofErr w:type="spellEnd"/>
     </w:p>
     <w:p>
       <w:pPr>
@@ -5758,7 +6810,21 @@
         <w:rPr>
           <w:rFonts w:ascii="Times New Roman" w:hAnsi="Times New Roman" w:cs="Times New Roman"/>
         </w:rPr>
-        <w:t>| ClassificationNode         |</w:t>
+        <w:t xml:space="preserve">| </w:t>
+      </w:r>
+      <w:proofErr w:type="spellStart"/>
+      <w:r>
+        <w:rPr>
+          <w:rFonts w:ascii="Times New Roman" w:hAnsi="Times New Roman" w:cs="Times New Roman"/>
+        </w:rPr>
+        <w:t>ClassificationNode</w:t>
+      </w:r>
+      <w:proofErr w:type="spellEnd"/>
+      <w:r>
+        <w:rPr>
+          <w:rFonts w:ascii="Times New Roman" w:hAnsi="Times New Roman" w:cs="Times New Roman"/>
+        </w:rPr>
+        <w:t xml:space="preserve">         |</w:t>
       </w:r>
     </w:p>
     <w:p>
@@ -5773,7 +6839,21 @@
         <w:rPr>
           <w:rFonts w:ascii="Times New Roman" w:hAnsi="Times New Roman" w:cs="Times New Roman"/>
         </w:rPr>
-        <w:t>| DuplicateDetectionNode     |</w:t>
+        <w:t xml:space="preserve">| </w:t>
+      </w:r>
+      <w:proofErr w:type="spellStart"/>
+      <w:r>
+        <w:rPr>
+          <w:rFonts w:ascii="Times New Roman" w:hAnsi="Times New Roman" w:cs="Times New Roman"/>
+        </w:rPr>
+        <w:t>DuplicateDetectionNode</w:t>
+      </w:r>
+      <w:proofErr w:type="spellEnd"/>
+      <w:r>
+        <w:rPr>
+          <w:rFonts w:ascii="Times New Roman" w:hAnsi="Times New Roman" w:cs="Times New Roman"/>
+        </w:rPr>
+        <w:t xml:space="preserve">     |</w:t>
       </w:r>
     </w:p>
     <w:p>
@@ -5788,7 +6868,21 @@
         <w:rPr>
           <w:rFonts w:ascii="Times New Roman" w:hAnsi="Times New Roman" w:cs="Times New Roman"/>
         </w:rPr>
-        <w:t>| SensitiveDetectionNode     |</w:t>
+        <w:t xml:space="preserve">| </w:t>
+      </w:r>
+      <w:proofErr w:type="spellStart"/>
+      <w:r>
+        <w:rPr>
+          <w:rFonts w:ascii="Times New Roman" w:hAnsi="Times New Roman" w:cs="Times New Roman"/>
+        </w:rPr>
+        <w:t>SensitiveDetectionNode</w:t>
+      </w:r>
+      <w:proofErr w:type="spellEnd"/>
+      <w:r>
+        <w:rPr>
+          <w:rFonts w:ascii="Times New Roman" w:hAnsi="Times New Roman" w:cs="Times New Roman"/>
+        </w:rPr>
+        <w:t xml:space="preserve">     |</w:t>
       </w:r>
     </w:p>
     <w:p>
@@ -5829,12 +6923,14 @@
           <w:rFonts w:ascii="Times New Roman" w:hAnsi="Times New Roman" w:cs="Times New Roman"/>
         </w:rPr>
       </w:pPr>
+      <w:proofErr w:type="spellStart"/>
       <w:r>
         <w:rPr>
           <w:rFonts w:ascii="Times New Roman" w:hAnsi="Times New Roman" w:cs="Times New Roman"/>
         </w:rPr>
         <w:t>OptimizationPlannerNode</w:t>
       </w:r>
+      <w:proofErr w:type="spellEnd"/>
     </w:p>
     <w:p>
       <w:pPr>
@@ -5859,12 +6955,14 @@
           <w:rFonts w:ascii="Times New Roman" w:hAnsi="Times New Roman" w:cs="Times New Roman"/>
         </w:rPr>
       </w:pPr>
+      <w:proofErr w:type="spellStart"/>
       <w:r>
         <w:rPr>
           <w:rFonts w:ascii="Times New Roman" w:hAnsi="Times New Roman" w:cs="Times New Roman"/>
         </w:rPr>
         <w:t>HITLApprovalNode</w:t>
       </w:r>
+      <w:proofErr w:type="spellEnd"/>
     </w:p>
     <w:p>
       <w:pPr>
@@ -5878,6 +6976,7 @@
         <w:rPr>
           <w:rFonts w:ascii="Times New Roman" w:hAnsi="Times New Roman" w:cs="Times New Roman"/>
         </w:rPr>
+        <w:lastRenderedPageBreak/>
         <w:t xml:space="preserve">    ↓</w:t>
       </w:r>
     </w:p>
@@ -5889,12 +6988,14 @@
           <w:rFonts w:ascii="Times New Roman" w:hAnsi="Times New Roman" w:cs="Times New Roman"/>
         </w:rPr>
       </w:pPr>
+      <w:proofErr w:type="spellStart"/>
       <w:r>
         <w:rPr>
           <w:rFonts w:ascii="Times New Roman" w:hAnsi="Times New Roman" w:cs="Times New Roman"/>
         </w:rPr>
         <w:t>ExecutionNode</w:t>
       </w:r>
+      <w:proofErr w:type="spellEnd"/>
     </w:p>
     <w:p>
       <w:pPr>
@@ -5919,12 +7020,14 @@
           <w:rFonts w:ascii="Times New Roman" w:hAnsi="Times New Roman" w:cs="Times New Roman"/>
         </w:rPr>
       </w:pPr>
+      <w:proofErr w:type="spellStart"/>
       <w:r>
         <w:rPr>
           <w:rFonts w:ascii="Times New Roman" w:hAnsi="Times New Roman" w:cs="Times New Roman"/>
         </w:rPr>
         <w:t>SummaryNode</w:t>
       </w:r>
+      <w:proofErr w:type="spellEnd"/>
     </w:p>
     <w:p>
       <w:pPr>
@@ -5979,12 +7082,42 @@
           <w:rFonts w:ascii="Times New Roman" w:hAnsi="Times New Roman" w:cs="Times New Roman"/>
         </w:rPr>
       </w:pPr>
-      <w:r>
-        <w:rPr>
-          <w:rFonts w:ascii="Times New Roman" w:hAnsi="Times New Roman" w:cs="Times New Roman"/>
-        </w:rPr>
-        <w:t>MyPCAssistantNode → FileDiscoveryNode (search mode) → MyPCAssistantNode</w:t>
-      </w:r>
+      <w:proofErr w:type="spellStart"/>
+      <w:r>
+        <w:rPr>
+          <w:rFonts w:ascii="Times New Roman" w:hAnsi="Times New Roman" w:cs="Times New Roman"/>
+        </w:rPr>
+        <w:t>MyPCAssistantNode</w:t>
+      </w:r>
+      <w:proofErr w:type="spellEnd"/>
+      <w:r>
+        <w:rPr>
+          <w:rFonts w:ascii="Times New Roman" w:hAnsi="Times New Roman" w:cs="Times New Roman"/>
+        </w:rPr>
+        <w:t xml:space="preserve"> → </w:t>
+      </w:r>
+      <w:proofErr w:type="spellStart"/>
+      <w:r>
+        <w:rPr>
+          <w:rFonts w:ascii="Times New Roman" w:hAnsi="Times New Roman" w:cs="Times New Roman"/>
+        </w:rPr>
+        <w:t>FileDiscoveryNode</w:t>
+      </w:r>
+      <w:proofErr w:type="spellEnd"/>
+      <w:r>
+        <w:rPr>
+          <w:rFonts w:ascii="Times New Roman" w:hAnsi="Times New Roman" w:cs="Times New Roman"/>
+        </w:rPr>
+        <w:t xml:space="preserve"> (search mode) → </w:t>
+      </w:r>
+      <w:proofErr w:type="spellStart"/>
+      <w:r>
+        <w:rPr>
+          <w:rFonts w:ascii="Times New Roman" w:hAnsi="Times New Roman" w:cs="Times New Roman"/>
+        </w:rPr>
+        <w:t>MyPCAssistantNode</w:t>
+      </w:r>
+      <w:proofErr w:type="spellEnd"/>
     </w:p>
     <w:p>
       <w:pPr>
@@ -6043,11 +7176,33 @@
           <w:rFonts w:ascii="Times New Roman" w:hAnsi="Times New Roman" w:cs="Times New Roman"/>
         </w:rPr>
       </w:pPr>
-      <w:r>
-        <w:rPr>
-          <w:rFonts w:ascii="Times New Roman" w:hAnsi="Times New Roman" w:cs="Times New Roman"/>
-        </w:rPr>
-        <w:t>WeeklyOrganizerNode → FileDiscoveryNode (safe mode) → Classification → Planner → Execution → Summary</w:t>
+      <w:proofErr w:type="spellStart"/>
+      <w:r>
+        <w:rPr>
+          <w:rFonts w:ascii="Times New Roman" w:hAnsi="Times New Roman" w:cs="Times New Roman"/>
+        </w:rPr>
+        <w:t>WeeklyOrganizerNode</w:t>
+      </w:r>
+      <w:proofErr w:type="spellEnd"/>
+      <w:r>
+        <w:rPr>
+          <w:rFonts w:ascii="Times New Roman" w:hAnsi="Times New Roman" w:cs="Times New Roman"/>
+        </w:rPr>
+        <w:t xml:space="preserve"> → </w:t>
+      </w:r>
+      <w:proofErr w:type="spellStart"/>
+      <w:r>
+        <w:rPr>
+          <w:rFonts w:ascii="Times New Roman" w:hAnsi="Times New Roman" w:cs="Times New Roman"/>
+        </w:rPr>
+        <w:t>FileDiscoveryNode</w:t>
+      </w:r>
+      <w:proofErr w:type="spellEnd"/>
+      <w:r>
+        <w:rPr>
+          <w:rFonts w:ascii="Times New Roman" w:hAnsi="Times New Roman" w:cs="Times New Roman"/>
+        </w:rPr>
+        <w:t xml:space="preserve"> (safe mode) → Classification → Planner → Execution → Summary</w:t>
       </w:r>
     </w:p>
     <w:p>
@@ -6104,12 +7259,14 @@
           <w:rFonts w:ascii="Times New Roman" w:hAnsi="Times New Roman" w:cs="Times New Roman"/>
         </w:rPr>
       </w:pPr>
+      <w:proofErr w:type="spellStart"/>
       <w:r>
         <w:rPr>
           <w:rFonts w:ascii="Times New Roman" w:hAnsi="Times New Roman" w:cs="Times New Roman"/>
         </w:rPr>
         <w:t>FolderScopeNode</w:t>
       </w:r>
+      <w:proofErr w:type="spellEnd"/>
     </w:p>
     <w:p>
       <w:pPr>
@@ -6122,28 +7279,29 @@
           <w:rFonts w:ascii="Times New Roman" w:hAnsi="Times New Roman" w:cs="Times New Roman"/>
         </w:rPr>
       </w:pPr>
+      <w:proofErr w:type="spellStart"/>
       <w:r>
         <w:rPr>
           <w:rFonts w:ascii="Times New Roman" w:hAnsi="Times New Roman" w:cs="Times New Roman"/>
         </w:rPr>
         <w:t>HITLApprovalNode</w:t>
       </w:r>
-    </w:p>
-    <w:p>
-      <w:pPr>
-        <w:rPr>
-          <w:rFonts w:ascii="Times New Roman" w:hAnsi="Times New Roman" w:cs="Times New Roman"/>
-          <w:b/>
-          <w:bCs/>
-        </w:rPr>
-      </w:pPr>
-      <w:r>
-        <w:rPr>
-          <w:rFonts w:ascii="Times New Roman" w:hAnsi="Times New Roman" w:cs="Times New Roman"/>
-          <w:b/>
-          <w:bCs/>
-        </w:rPr>
-        <w:lastRenderedPageBreak/>
+      <w:proofErr w:type="spellEnd"/>
+    </w:p>
+    <w:p>
+      <w:pPr>
+        <w:rPr>
+          <w:rFonts w:ascii="Times New Roman" w:hAnsi="Times New Roman" w:cs="Times New Roman"/>
+          <w:b/>
+          <w:bCs/>
+        </w:rPr>
+      </w:pPr>
+      <w:r>
+        <w:rPr>
+          <w:rFonts w:ascii="Times New Roman" w:hAnsi="Times New Roman" w:cs="Times New Roman"/>
+          <w:b/>
+          <w:bCs/>
+        </w:rPr>
         <w:t>Optional HITL:</w:t>
       </w:r>
     </w:p>
@@ -6157,11 +7315,19 @@
           <w:rFonts w:ascii="Times New Roman" w:hAnsi="Times New Roman" w:cs="Times New Roman"/>
         </w:rPr>
       </w:pPr>
-      <w:r>
-        <w:rPr>
-          <w:rFonts w:ascii="Times New Roman" w:hAnsi="Times New Roman" w:cs="Times New Roman"/>
-        </w:rPr>
-        <w:t>MyPCAssistantNode (when user asks for confirmation)</w:t>
+      <w:proofErr w:type="spellStart"/>
+      <w:r>
+        <w:rPr>
+          <w:rFonts w:ascii="Times New Roman" w:hAnsi="Times New Roman" w:cs="Times New Roman"/>
+        </w:rPr>
+        <w:t>MyPCAssistantNode</w:t>
+      </w:r>
+      <w:proofErr w:type="spellEnd"/>
+      <w:r>
+        <w:rPr>
+          <w:rFonts w:ascii="Times New Roman" w:hAnsi="Times New Roman" w:cs="Times New Roman"/>
+        </w:rPr>
+        <w:t xml:space="preserve"> (when user asks for confirmation)</w:t>
       </w:r>
     </w:p>
     <w:p>
@@ -6228,7 +7394,21 @@
         <w:rPr>
           <w:rFonts w:ascii="Times New Roman" w:hAnsi="Times New Roman" w:cs="Times New Roman"/>
         </w:rPr>
-        <w:t>Cleanup workflows may only begin after MyPCAssistantNode detects explicit cleanup intent.</w:t>
+        <w:t xml:space="preserve">Cleanup workflows may only begin after </w:t>
+      </w:r>
+      <w:proofErr w:type="spellStart"/>
+      <w:r>
+        <w:rPr>
+          <w:rFonts w:ascii="Times New Roman" w:hAnsi="Times New Roman" w:cs="Times New Roman"/>
+        </w:rPr>
+        <w:t>MyPCAssistantNode</w:t>
+      </w:r>
+      <w:proofErr w:type="spellEnd"/>
+      <w:r>
+        <w:rPr>
+          <w:rFonts w:ascii="Times New Roman" w:hAnsi="Times New Roman" w:cs="Times New Roman"/>
+        </w:rPr>
+        <w:t xml:space="preserve"> detects explicit cleanup intent.</w:t>
       </w:r>
     </w:p>
     <w:p>
@@ -6244,11 +7424,19 @@
           <w:bCs/>
         </w:rPr>
       </w:pPr>
-      <w:r>
-        <w:rPr>
-          <w:rFonts w:ascii="Times New Roman" w:hAnsi="Times New Roman" w:cs="Times New Roman"/>
-        </w:rPr>
-        <w:t>FolderScopeNode must never run automatically.</w:t>
+      <w:proofErr w:type="spellStart"/>
+      <w:r>
+        <w:rPr>
+          <w:rFonts w:ascii="Times New Roman" w:hAnsi="Times New Roman" w:cs="Times New Roman"/>
+        </w:rPr>
+        <w:t>FolderScopeNode</w:t>
+      </w:r>
+      <w:proofErr w:type="spellEnd"/>
+      <w:r>
+        <w:rPr>
+          <w:rFonts w:ascii="Times New Roman" w:hAnsi="Times New Roman" w:cs="Times New Roman"/>
+        </w:rPr>
+        <w:t xml:space="preserve"> must never run automatically.</w:t>
       </w:r>
     </w:p>
     <w:p>
@@ -6287,12 +7475,14 @@
           <w:rFonts w:ascii="Times New Roman" w:hAnsi="Times New Roman" w:cs="Times New Roman"/>
         </w:rPr>
       </w:pPr>
+      <w:proofErr w:type="spellStart"/>
       <w:r>
         <w:rPr>
           <w:rFonts w:ascii="Times New Roman" w:hAnsi="Times New Roman" w:cs="Times New Roman"/>
         </w:rPr>
         <w:t>FileDiscoveryNode</w:t>
       </w:r>
+      <w:proofErr w:type="spellEnd"/>
     </w:p>
     <w:p>
       <w:pPr>
@@ -6305,12 +7495,14 @@
           <w:rFonts w:ascii="Times New Roman" w:hAnsi="Times New Roman" w:cs="Times New Roman"/>
         </w:rPr>
       </w:pPr>
+      <w:proofErr w:type="spellStart"/>
       <w:r>
         <w:rPr>
           <w:rFonts w:ascii="Times New Roman" w:hAnsi="Times New Roman" w:cs="Times New Roman"/>
         </w:rPr>
         <w:t>DuplicateDetectionNode</w:t>
       </w:r>
+      <w:proofErr w:type="spellEnd"/>
     </w:p>
     <w:p>
       <w:pPr>
@@ -6323,12 +7515,14 @@
           <w:rFonts w:ascii="Times New Roman" w:hAnsi="Times New Roman" w:cs="Times New Roman"/>
         </w:rPr>
       </w:pPr>
+      <w:proofErr w:type="spellStart"/>
       <w:r>
         <w:rPr>
           <w:rFonts w:ascii="Times New Roman" w:hAnsi="Times New Roman" w:cs="Times New Roman"/>
         </w:rPr>
         <w:t>SensitiveDetectionNode</w:t>
       </w:r>
+      <w:proofErr w:type="spellEnd"/>
     </w:p>
     <w:p>
       <w:pPr>
@@ -6341,12 +7535,14 @@
           <w:rFonts w:ascii="Times New Roman" w:hAnsi="Times New Roman" w:cs="Times New Roman"/>
         </w:rPr>
       </w:pPr>
+      <w:proofErr w:type="spellStart"/>
       <w:r>
         <w:rPr>
           <w:rFonts w:ascii="Times New Roman" w:hAnsi="Times New Roman" w:cs="Times New Roman"/>
         </w:rPr>
         <w:t>OptimizationPlannerNode</w:t>
       </w:r>
+      <w:proofErr w:type="spellEnd"/>
     </w:p>
     <w:p>
       <w:pPr>
@@ -6359,12 +7555,15 @@
           <w:rFonts w:ascii="Times New Roman" w:hAnsi="Times New Roman" w:cs="Times New Roman"/>
         </w:rPr>
       </w:pPr>
-      <w:r>
-        <w:rPr>
-          <w:rFonts w:ascii="Times New Roman" w:hAnsi="Times New Roman" w:cs="Times New Roman"/>
-        </w:rPr>
+      <w:proofErr w:type="spellStart"/>
+      <w:r>
+        <w:rPr>
+          <w:rFonts w:ascii="Times New Roman" w:hAnsi="Times New Roman" w:cs="Times New Roman"/>
+        </w:rPr>
+        <w:lastRenderedPageBreak/>
         <w:t>ExecutionNode</w:t>
       </w:r>
+      <w:proofErr w:type="spellEnd"/>
     </w:p>
     <w:p>
       <w:pPr>
@@ -6402,12 +7601,14 @@
           <w:rFonts w:ascii="Times New Roman" w:hAnsi="Times New Roman" w:cs="Times New Roman"/>
         </w:rPr>
       </w:pPr>
+      <w:proofErr w:type="spellStart"/>
       <w:r>
         <w:rPr>
           <w:rFonts w:ascii="Times New Roman" w:hAnsi="Times New Roman" w:cs="Times New Roman"/>
         </w:rPr>
         <w:t>SensitiveDetectionNode</w:t>
       </w:r>
+      <w:proofErr w:type="spellEnd"/>
     </w:p>
     <w:p>
       <w:pPr>
@@ -6420,12 +7621,14 @@
           <w:rFonts w:ascii="Times New Roman" w:hAnsi="Times New Roman" w:cs="Times New Roman"/>
         </w:rPr>
       </w:pPr>
+      <w:proofErr w:type="spellStart"/>
       <w:r>
         <w:rPr>
           <w:rFonts w:ascii="Times New Roman" w:hAnsi="Times New Roman" w:cs="Times New Roman"/>
         </w:rPr>
         <w:t>OptimizationPlannerNode</w:t>
       </w:r>
+      <w:proofErr w:type="spellEnd"/>
     </w:p>
     <w:p>
       <w:pPr>
@@ -6438,12 +7641,14 @@
           <w:rFonts w:ascii="Times New Roman" w:hAnsi="Times New Roman" w:cs="Times New Roman"/>
         </w:rPr>
       </w:pPr>
+      <w:proofErr w:type="spellStart"/>
       <w:r>
         <w:rPr>
           <w:rFonts w:ascii="Times New Roman" w:hAnsi="Times New Roman" w:cs="Times New Roman"/>
         </w:rPr>
         <w:t>ExecutionNode</w:t>
       </w:r>
+      <w:proofErr w:type="spellEnd"/>
     </w:p>
     <w:p>
       <w:pPr>
@@ -6481,12 +7686,14 @@
           <w:rFonts w:ascii="Times New Roman" w:hAnsi="Times New Roman" w:cs="Times New Roman"/>
         </w:rPr>
       </w:pPr>
+      <w:proofErr w:type="spellStart"/>
       <w:r>
         <w:rPr>
           <w:rFonts w:ascii="Times New Roman" w:hAnsi="Times New Roman" w:cs="Times New Roman"/>
         </w:rPr>
         <w:t>HITLApprovalNode</w:t>
       </w:r>
+      <w:proofErr w:type="spellEnd"/>
     </w:p>
     <w:p>
       <w:pPr>
@@ -6518,7 +7725,29 @@
           <w:kern w:val="0"/>
           <w14:ligatures w14:val="none"/>
         </w:rPr>
-        <w:t xml:space="preserve"> WeeklyOrganizerNode runs in safe mode:</w:t>
+        <w:t xml:space="preserve"> </w:t>
+      </w:r>
+      <w:proofErr w:type="spellStart"/>
+      <w:r>
+        <w:rPr>
+          <w:rFonts w:ascii="Times New Roman" w:eastAsia="Times New Roman" w:hAnsi="Times New Roman" w:cs="Times New Roman"/>
+          <w:b/>
+          <w:bCs/>
+          <w:kern w:val="0"/>
+          <w14:ligatures w14:val="none"/>
+        </w:rPr>
+        <w:t>WeeklyOrganizerNode</w:t>
+      </w:r>
+      <w:proofErr w:type="spellEnd"/>
+      <w:r>
+        <w:rPr>
+          <w:rFonts w:ascii="Times New Roman" w:eastAsia="Times New Roman" w:hAnsi="Times New Roman" w:cs="Times New Roman"/>
+          <w:b/>
+          <w:bCs/>
+          <w:kern w:val="0"/>
+          <w14:ligatures w14:val="none"/>
+        </w:rPr>
+        <w:t xml:space="preserve"> runs in safe mode:</w:t>
       </w:r>
     </w:p>
     <w:p>
@@ -6764,7 +7993,6 @@
           <w:b/>
           <w:bCs/>
         </w:rPr>
-        <w:lastRenderedPageBreak/>
         <w:t>8. Error Handling</w:t>
       </w:r>
     </w:p>
@@ -6784,8 +8012,16 @@
         <w:rPr>
           <w:rFonts w:ascii="Times New Roman" w:hAnsi="Times New Roman" w:cs="Times New Roman"/>
         </w:rPr>
-        <w:t>If user intent unclear → return to MyPCAssistantNode</w:t>
-      </w:r>
+        <w:t xml:space="preserve">If user intent unclear → return to </w:t>
+      </w:r>
+      <w:proofErr w:type="spellStart"/>
+      <w:r>
+        <w:rPr>
+          <w:rFonts w:ascii="Times New Roman" w:hAnsi="Times New Roman" w:cs="Times New Roman"/>
+        </w:rPr>
+        <w:t>MyPCAssistantNode</w:t>
+      </w:r>
+      <w:proofErr w:type="spellEnd"/>
     </w:p>
     <w:p>
       <w:pPr>
@@ -6803,8 +8039,16 @@
         <w:rPr>
           <w:rFonts w:ascii="Times New Roman" w:hAnsi="Times New Roman" w:cs="Times New Roman"/>
         </w:rPr>
-        <w:t>If folder scope invalid → return to FolderScopeNode</w:t>
-      </w:r>
+        <w:t xml:space="preserve">If folder scope invalid → return to </w:t>
+      </w:r>
+      <w:proofErr w:type="spellStart"/>
+      <w:r>
+        <w:rPr>
+          <w:rFonts w:ascii="Times New Roman" w:hAnsi="Times New Roman" w:cs="Times New Roman"/>
+        </w:rPr>
+        <w:t>FolderScopeNode</w:t>
+      </w:r>
+      <w:proofErr w:type="spellEnd"/>
     </w:p>
     <w:p>
       <w:pPr>
@@ -6841,8 +8085,16 @@
         <w:rPr>
           <w:rFonts w:ascii="Times New Roman" w:hAnsi="Times New Roman" w:cs="Times New Roman"/>
         </w:rPr>
-        <w:t>If user rejects plan → SummaryNode</w:t>
-      </w:r>
+        <w:t xml:space="preserve">If user rejects plan → </w:t>
+      </w:r>
+      <w:proofErr w:type="spellStart"/>
+      <w:r>
+        <w:rPr>
+          <w:rFonts w:ascii="Times New Roman" w:hAnsi="Times New Roman" w:cs="Times New Roman"/>
+        </w:rPr>
+        <w:t>SummaryNode</w:t>
+      </w:r>
+      <w:proofErr w:type="spellEnd"/>
     </w:p>
     <w:p>
       <w:pPr>
@@ -6860,8 +8112,16 @@
         <w:rPr>
           <w:rFonts w:ascii="Times New Roman" w:hAnsi="Times New Roman" w:cs="Times New Roman"/>
         </w:rPr>
-        <w:t>If execution fails → RollbackNode</w:t>
-      </w:r>
+        <w:t xml:space="preserve">If execution fails → </w:t>
+      </w:r>
+      <w:proofErr w:type="spellStart"/>
+      <w:r>
+        <w:rPr>
+          <w:rFonts w:ascii="Times New Roman" w:hAnsi="Times New Roman" w:cs="Times New Roman"/>
+        </w:rPr>
+        <w:t>RollbackNode</w:t>
+      </w:r>
+      <w:proofErr w:type="spellEnd"/>
     </w:p>
     <w:p>
       <w:pPr>
@@ -13033,6 +14293,119 @@
     </w:lvl>
   </w:abstractNum>
   <w:abstractNum w:abstractNumId="43" w15:restartNumberingAfterBreak="0">
+    <w:nsid w:val="6B196FC2"/>
+    <w:multiLevelType w:val="hybridMultilevel"/>
+    <w:tmpl w:val="905A6824"/>
+    <w:lvl w:ilvl="0" w:tplc="04090001">
+      <w:start w:val="1"/>
+      <w:numFmt w:val="bullet"/>
+      <w:lvlText w:val=""/>
+      <w:lvlJc w:val="left"/>
+      <w:pPr>
+        <w:ind w:left="720" w:hanging="360"/>
+      </w:pPr>
+      <w:rPr>
+        <w:rFonts w:ascii="Symbol" w:hAnsi="Symbol" w:hint="default"/>
+      </w:rPr>
+    </w:lvl>
+    <w:lvl w:ilvl="1" w:tplc="04090003">
+      <w:start w:val="1"/>
+      <w:numFmt w:val="bullet"/>
+      <w:lvlText w:val="o"/>
+      <w:lvlJc w:val="left"/>
+      <w:pPr>
+        <w:ind w:left="1440" w:hanging="360"/>
+      </w:pPr>
+      <w:rPr>
+        <w:rFonts w:ascii="Courier New" w:hAnsi="Courier New" w:cs="Courier New" w:hint="default"/>
+      </w:rPr>
+    </w:lvl>
+    <w:lvl w:ilvl="2" w:tplc="04090005" w:tentative="1">
+      <w:start w:val="1"/>
+      <w:numFmt w:val="bullet"/>
+      <w:lvlText w:val=""/>
+      <w:lvlJc w:val="left"/>
+      <w:pPr>
+        <w:ind w:left="2160" w:hanging="360"/>
+      </w:pPr>
+      <w:rPr>
+        <w:rFonts w:ascii="Wingdings" w:hAnsi="Wingdings" w:hint="default"/>
+      </w:rPr>
+    </w:lvl>
+    <w:lvl w:ilvl="3" w:tplc="04090001" w:tentative="1">
+      <w:start w:val="1"/>
+      <w:numFmt w:val="bullet"/>
+      <w:lvlText w:val=""/>
+      <w:lvlJc w:val="left"/>
+      <w:pPr>
+        <w:ind w:left="2880" w:hanging="360"/>
+      </w:pPr>
+      <w:rPr>
+        <w:rFonts w:ascii="Symbol" w:hAnsi="Symbol" w:hint="default"/>
+      </w:rPr>
+    </w:lvl>
+    <w:lvl w:ilvl="4" w:tplc="04090003" w:tentative="1">
+      <w:start w:val="1"/>
+      <w:numFmt w:val="bullet"/>
+      <w:lvlText w:val="o"/>
+      <w:lvlJc w:val="left"/>
+      <w:pPr>
+        <w:ind w:left="3600" w:hanging="360"/>
+      </w:pPr>
+      <w:rPr>
+        <w:rFonts w:ascii="Courier New" w:hAnsi="Courier New" w:cs="Courier New" w:hint="default"/>
+      </w:rPr>
+    </w:lvl>
+    <w:lvl w:ilvl="5" w:tplc="04090005" w:tentative="1">
+      <w:start w:val="1"/>
+      <w:numFmt w:val="bullet"/>
+      <w:lvlText w:val=""/>
+      <w:lvlJc w:val="left"/>
+      <w:pPr>
+        <w:ind w:left="4320" w:hanging="360"/>
+      </w:pPr>
+      <w:rPr>
+        <w:rFonts w:ascii="Wingdings" w:hAnsi="Wingdings" w:hint="default"/>
+      </w:rPr>
+    </w:lvl>
+    <w:lvl w:ilvl="6" w:tplc="04090001" w:tentative="1">
+      <w:start w:val="1"/>
+      <w:numFmt w:val="bullet"/>
+      <w:lvlText w:val=""/>
+      <w:lvlJc w:val="left"/>
+      <w:pPr>
+        <w:ind w:left="5040" w:hanging="360"/>
+      </w:pPr>
+      <w:rPr>
+        <w:rFonts w:ascii="Symbol" w:hAnsi="Symbol" w:hint="default"/>
+      </w:rPr>
+    </w:lvl>
+    <w:lvl w:ilvl="7" w:tplc="04090003" w:tentative="1">
+      <w:start w:val="1"/>
+      <w:numFmt w:val="bullet"/>
+      <w:lvlText w:val="o"/>
+      <w:lvlJc w:val="left"/>
+      <w:pPr>
+        <w:ind w:left="5760" w:hanging="360"/>
+      </w:pPr>
+      <w:rPr>
+        <w:rFonts w:ascii="Courier New" w:hAnsi="Courier New" w:cs="Courier New" w:hint="default"/>
+      </w:rPr>
+    </w:lvl>
+    <w:lvl w:ilvl="8" w:tplc="04090005" w:tentative="1">
+      <w:start w:val="1"/>
+      <w:numFmt w:val="bullet"/>
+      <w:lvlText w:val=""/>
+      <w:lvlJc w:val="left"/>
+      <w:pPr>
+        <w:ind w:left="6480" w:hanging="360"/>
+      </w:pPr>
+      <w:rPr>
+        <w:rFonts w:ascii="Wingdings" w:hAnsi="Wingdings" w:hint="default"/>
+      </w:rPr>
+    </w:lvl>
+  </w:abstractNum>
+  <w:abstractNum w:abstractNumId="44" w15:restartNumberingAfterBreak="0">
     <w:nsid w:val="6CCD329E"/>
     <w:multiLevelType w:val="multilevel"/>
     <w:tmpl w:val="8408B7D4"/>
@@ -13181,7 +14554,7 @@
       </w:rPr>
     </w:lvl>
   </w:abstractNum>
-  <w:abstractNum w:abstractNumId="44" w15:restartNumberingAfterBreak="0">
+  <w:abstractNum w:abstractNumId="45" w15:restartNumberingAfterBreak="0">
     <w:nsid w:val="6D9A0886"/>
     <w:multiLevelType w:val="multilevel"/>
     <w:tmpl w:val="61BA83CC"/>
@@ -13330,7 +14703,7 @@
       </w:rPr>
     </w:lvl>
   </w:abstractNum>
-  <w:abstractNum w:abstractNumId="45" w15:restartNumberingAfterBreak="0">
+  <w:abstractNum w:abstractNumId="46" w15:restartNumberingAfterBreak="0">
     <w:nsid w:val="6DD0140E"/>
     <w:multiLevelType w:val="hybridMultilevel"/>
     <w:tmpl w:val="FCD07B1E"/>
@@ -13443,7 +14816,7 @@
       </w:rPr>
     </w:lvl>
   </w:abstractNum>
-  <w:abstractNum w:abstractNumId="46" w15:restartNumberingAfterBreak="0">
+  <w:abstractNum w:abstractNumId="47" w15:restartNumberingAfterBreak="0">
     <w:nsid w:val="6FF97C8C"/>
     <w:multiLevelType w:val="hybridMultilevel"/>
     <w:tmpl w:val="9FAE78D0"/>
@@ -13556,7 +14929,7 @@
       </w:rPr>
     </w:lvl>
   </w:abstractNum>
-  <w:abstractNum w:abstractNumId="47" w15:restartNumberingAfterBreak="0">
+  <w:abstractNum w:abstractNumId="48" w15:restartNumberingAfterBreak="0">
     <w:nsid w:val="70326B35"/>
     <w:multiLevelType w:val="multilevel"/>
     <w:tmpl w:val="8408B7D4"/>
@@ -13705,7 +15078,7 @@
       </w:rPr>
     </w:lvl>
   </w:abstractNum>
-  <w:abstractNum w:abstractNumId="48" w15:restartNumberingAfterBreak="0">
+  <w:abstractNum w:abstractNumId="49" w15:restartNumberingAfterBreak="0">
     <w:nsid w:val="70F23F00"/>
     <w:multiLevelType w:val="multilevel"/>
     <w:tmpl w:val="66183624"/>
@@ -13864,7 +15237,7 @@
     <w:abstractNumId w:val="40"/>
   </w:num>
   <w:num w:numId="4" w16cid:durableId="1734237254">
-    <w:abstractNumId w:val="44"/>
+    <w:abstractNumId w:val="45"/>
   </w:num>
   <w:num w:numId="5" w16cid:durableId="1228682357">
     <w:abstractNumId w:val="18"/>
@@ -13873,7 +15246,7 @@
     <w:abstractNumId w:val="8"/>
   </w:num>
   <w:num w:numId="7" w16cid:durableId="1139303167">
-    <w:abstractNumId w:val="48"/>
+    <w:abstractNumId w:val="49"/>
   </w:num>
   <w:num w:numId="8" w16cid:durableId="1448159698">
     <w:abstractNumId w:val="11"/>
@@ -13927,7 +15300,7 @@
     <w:abstractNumId w:val="32"/>
   </w:num>
   <w:num w:numId="25" w16cid:durableId="285048362">
-    <w:abstractNumId w:val="45"/>
+    <w:abstractNumId w:val="46"/>
   </w:num>
   <w:num w:numId="26" w16cid:durableId="1837451852">
     <w:abstractNumId w:val="12"/>
@@ -13939,7 +15312,7 @@
     <w:abstractNumId w:val="24"/>
   </w:num>
   <w:num w:numId="29" w16cid:durableId="1759518063">
-    <w:abstractNumId w:val="46"/>
+    <w:abstractNumId w:val="47"/>
   </w:num>
   <w:num w:numId="30" w16cid:durableId="656543412">
     <w:abstractNumId w:val="23"/>
@@ -13981,13 +15354,13 @@
     <w:abstractNumId w:val="6"/>
   </w:num>
   <w:num w:numId="43" w16cid:durableId="364018359">
-    <w:abstractNumId w:val="47"/>
+    <w:abstractNumId w:val="48"/>
   </w:num>
   <w:num w:numId="44" w16cid:durableId="1101223755">
     <w:abstractNumId w:val="16"/>
   </w:num>
   <w:num w:numId="45" w16cid:durableId="840239577">
-    <w:abstractNumId w:val="43"/>
+    <w:abstractNumId w:val="44"/>
   </w:num>
   <w:num w:numId="46" w16cid:durableId="1632784706">
     <w:abstractNumId w:val="19"/>
@@ -14000,6 +15373,9 @@
   </w:num>
   <w:num w:numId="49" w16cid:durableId="61491396">
     <w:abstractNumId w:val="34"/>
+  </w:num>
+  <w:num w:numId="50" w16cid:durableId="1239444900">
+    <w:abstractNumId w:val="43"/>
   </w:num>
 </w:numbering>
 </file>
@@ -14606,7 +15982,6 @@
   <w:style w:type="character" w:default="1" w:styleId="DefaultParagraphFont">
     <w:name w:val="Default Paragraph Font"/>
     <w:uiPriority w:val="1"/>
-    <w:semiHidden/>
     <w:unhideWhenUsed/>
   </w:style>
   <w:style w:type="table" w:default="1" w:styleId="TableNormal">

</xml_diff>